<commit_message>
AWS Test prep, updated files being added-Nov2025
</commit_message>
<xml_diff>
--- a/AWS_FreeTest7AQuiz-Ans_doc_Format.docx
+++ b/AWS_FreeTest7AQuiz-Ans_doc_Format.docx
@@ -459,6 +459,530 @@
         <w:rPr>
           <w:lang w:val="en-US"/>
         </w:rPr>
+        <w:t>What should the solutions architect do to meet these requirements with the LEAST amount of operational overhead?</w:t>
+      </w:r>
+    </w:p>
+    <w:p>
+      <w:pPr>
+        <w:rPr>
+          <w:lang w:val="en-US"/>
+        </w:rPr>
+      </w:pPr>
+    </w:p>
+    <w:p>
+      <w:pPr>
+        <w:rPr>
+          <w:lang w:val="en-US"/>
+        </w:rPr>
+      </w:pPr>
+      <w:proofErr w:type="spellStart"/>
+      <w:r>
+        <w:rPr>
+          <w:lang w:val="en-US"/>
+        </w:rPr>
+        <w:t>ans</w:t>
+      </w:r>
+      <w:proofErr w:type="spellEnd"/>
+      <w:r>
+        <w:rPr>
+          <w:lang w:val="en-US"/>
+        </w:rPr>
+        <w:t>-Use Amazon Athena directly with Amazon S3 to run the queries as needed.</w:t>
+      </w:r>
+    </w:p>
+    <w:p>
+      <w:pPr>
+        <w:rPr>
+          <w:lang w:val="en-US"/>
+        </w:rPr>
+      </w:pPr>
+    </w:p>
+    <w:p>
+      <w:pPr>
+        <w:rPr>
+          <w:lang w:val="en-US"/>
+        </w:rPr>
+      </w:pPr>
+      <w:r>
+        <w:rPr>
+          <w:lang w:val="en-US"/>
+        </w:rPr>
+        <w:t>Amazon Athena is an interactive query service that makes it easy to analyze data directly in Amazon Simple Storage Service (Amazon S3) using standard SQL. With a few actions in the AWS Management Console, you can point Athena at your data stored in Amazon S3 and begin using standard SQL to run ad-hoc queries and get results in seconds.</w:t>
+      </w:r>
+    </w:p>
+    <w:p>
+      <w:pPr>
+        <w:rPr>
+          <w:lang w:val="en-US"/>
+        </w:rPr>
+      </w:pPr>
+      <w:r>
+        <w:rPr>
+          <w:lang w:val="en-US"/>
+        </w:rPr>
+        <w:t>---------------------------------------------------------------</w:t>
+      </w:r>
+    </w:p>
+    <w:p>
+      <w:pPr>
+        <w:rPr>
+          <w:lang w:val="en-US"/>
+        </w:rPr>
+      </w:pPr>
+    </w:p>
+    <w:p>
+      <w:pPr>
+        <w:rPr>
+          <w:lang w:val="en-US"/>
+        </w:rPr>
+      </w:pPr>
+      <w:r>
+        <w:rPr>
+          <w:lang w:val="en-US"/>
+        </w:rPr>
+        <w:t>3</w:t>
+      </w:r>
+      <w:r>
+        <w:rPr>
+          <w:lang w:val="en-US"/>
+        </w:rPr>
+        <w:t xml:space="preserve">] </w:t>
+      </w:r>
+      <w:r>
+        <w:rPr>
+          <w:lang w:val="en-US"/>
+        </w:rPr>
+        <w:t>A company uses AWS Organizations to manage multiple AWS accounts for different departments. The management account has an Amazon S3 bucket that contains project reports. The company wants to limit access to this S3 bucket to only users of accounts within the organization in AWS Organizations.</w:t>
+      </w:r>
+    </w:p>
+    <w:p>
+      <w:pPr>
+        <w:rPr>
+          <w:lang w:val="en-US"/>
+        </w:rPr>
+      </w:pPr>
+      <w:r>
+        <w:rPr>
+          <w:lang w:val="en-US"/>
+        </w:rPr>
+        <w:t>Which solution meets these requirements with the LEAST amount of operational overhead?</w:t>
+      </w:r>
+    </w:p>
+    <w:p>
+      <w:pPr>
+        <w:rPr>
+          <w:lang w:val="en-US"/>
+        </w:rPr>
+      </w:pPr>
+    </w:p>
+    <w:p>
+      <w:pPr>
+        <w:rPr>
+          <w:lang w:val="en-US"/>
+        </w:rPr>
+      </w:pPr>
+      <w:proofErr w:type="spellStart"/>
+      <w:r>
+        <w:rPr>
+          <w:lang w:val="en-US"/>
+        </w:rPr>
+        <w:t>ans</w:t>
+      </w:r>
+      <w:proofErr w:type="spellEnd"/>
+      <w:r>
+        <w:rPr>
+          <w:lang w:val="en-US"/>
+        </w:rPr>
+        <w:t xml:space="preserve">-. Add the </w:t>
+      </w:r>
+      <w:proofErr w:type="spellStart"/>
+      <w:r>
+        <w:rPr>
+          <w:lang w:val="en-US"/>
+        </w:rPr>
+        <w:t>aws</w:t>
+      </w:r>
+      <w:proofErr w:type="spellEnd"/>
+      <w:r>
+        <w:rPr>
+          <w:lang w:val="en-US"/>
+        </w:rPr>
+        <w:t xml:space="preserve"> </w:t>
+      </w:r>
+      <w:proofErr w:type="spellStart"/>
+      <w:r>
+        <w:rPr>
+          <w:lang w:val="en-US"/>
+        </w:rPr>
+        <w:t>PrincipalOrgID</w:t>
+      </w:r>
+      <w:proofErr w:type="spellEnd"/>
+      <w:r>
+        <w:rPr>
+          <w:lang w:val="en-US"/>
+        </w:rPr>
+        <w:t xml:space="preserve"> global condition key with a reference to the organization ID to the S3 bucket policy.</w:t>
+      </w:r>
+    </w:p>
+    <w:p>
+      <w:pPr>
+        <w:rPr>
+          <w:lang w:val="en-US"/>
+        </w:rPr>
+      </w:pPr>
+    </w:p>
+    <w:p>
+      <w:pPr>
+        <w:rPr>
+          <w:lang w:val="en-US"/>
+        </w:rPr>
+      </w:pPr>
+      <w:proofErr w:type="spellStart"/>
+      <w:r>
+        <w:rPr>
+          <w:lang w:val="en-US"/>
+        </w:rPr>
+        <w:t>aws:PrincipalOrgID</w:t>
+      </w:r>
+      <w:proofErr w:type="spellEnd"/>
+      <w:r>
+        <w:rPr>
+          <w:lang w:val="en-US"/>
+        </w:rPr>
+        <w:t xml:space="preserve"> – </w:t>
+      </w:r>
+      <w:r>
+        <w:rPr>
+          <w:b/>
+          <w:bCs/>
+          <w:highlight w:val="green"/>
+          <w:lang w:val="en-US"/>
+        </w:rPr>
+        <w:t>Simplifies specifying</w:t>
+      </w:r>
+      <w:r>
+        <w:rPr>
+          <w:lang w:val="en-US"/>
+        </w:rPr>
+        <w:t xml:space="preserve"> the </w:t>
+      </w:r>
+      <w:r>
+        <w:rPr>
+          <w:b/>
+          <w:bCs/>
+          <w:highlight w:val="green"/>
+          <w:lang w:val="en-US"/>
+        </w:rPr>
+        <w:t>Principal</w:t>
+      </w:r>
+      <w:r>
+        <w:rPr>
+          <w:lang w:val="en-US"/>
+        </w:rPr>
+        <w:t xml:space="preserve"> element in a resource-based policy. This global key provides an alternative to listing all the account IDs for all AWS accounts in an organization. Instead of listing all of the accounts that are members of an organization, you can specify the organization ID in the Condition element.</w:t>
+      </w:r>
+    </w:p>
+    <w:p>
+      <w:pPr>
+        <w:rPr>
+          <w:lang w:val="en-US"/>
+        </w:rPr>
+      </w:pPr>
+      <w:r>
+        <w:rPr>
+          <w:lang w:val="en-US"/>
+        </w:rPr>
+        <w:t xml:space="preserve">proposes adding the </w:t>
+      </w:r>
+      <w:proofErr w:type="spellStart"/>
+      <w:r>
+        <w:rPr>
+          <w:lang w:val="en-US"/>
+        </w:rPr>
+        <w:t>aws</w:t>
+      </w:r>
+      <w:proofErr w:type="spellEnd"/>
+      <w:r>
+        <w:rPr>
+          <w:lang w:val="en-US"/>
+        </w:rPr>
+        <w:t xml:space="preserve"> </w:t>
+      </w:r>
+      <w:proofErr w:type="spellStart"/>
+      <w:r>
+        <w:rPr>
+          <w:lang w:val="en-US"/>
+        </w:rPr>
+        <w:t>PrincipalOrgID</w:t>
+      </w:r>
+      <w:proofErr w:type="spellEnd"/>
+      <w:r>
+        <w:rPr>
+          <w:lang w:val="en-US"/>
+        </w:rPr>
+        <w:t xml:space="preserve"> global condition key with a reference to the organization ID to the S3 bucket policy. This would limit access to the S3 bucket to only users of accounts within the organization in AWS Organizations, as the </w:t>
+      </w:r>
+      <w:proofErr w:type="spellStart"/>
+      <w:r>
+        <w:rPr>
+          <w:lang w:val="en-US"/>
+        </w:rPr>
+        <w:t>aws</w:t>
+      </w:r>
+      <w:proofErr w:type="spellEnd"/>
+      <w:r>
+        <w:rPr>
+          <w:lang w:val="en-US"/>
+        </w:rPr>
+        <w:t xml:space="preserve"> </w:t>
+      </w:r>
+      <w:proofErr w:type="spellStart"/>
+      <w:r>
+        <w:rPr>
+          <w:lang w:val="en-US"/>
+        </w:rPr>
+        <w:t>PrincipalOrgID</w:t>
+      </w:r>
+      <w:proofErr w:type="spellEnd"/>
+      <w:r>
+        <w:rPr>
+          <w:lang w:val="en-US"/>
+        </w:rPr>
+        <w:t xml:space="preserve"> condition key can check if the request is coming from within the organization.</w:t>
+      </w:r>
+    </w:p>
+    <w:p>
+      <w:pPr>
+        <w:rPr>
+          <w:lang w:val="en-US"/>
+        </w:rPr>
+      </w:pPr>
+      <w:r>
+        <w:rPr>
+          <w:lang w:val="en-US"/>
+        </w:rPr>
+        <w:t>--------------------------------------------------------------------------</w:t>
+      </w:r>
+    </w:p>
+    <w:p>
+      <w:pPr>
+        <w:rPr>
+          <w:lang w:val="en-US"/>
+        </w:rPr>
+      </w:pPr>
+    </w:p>
+    <w:p>
+      <w:pPr>
+        <w:rPr>
+          <w:lang w:val="en-US"/>
+        </w:rPr>
+      </w:pPr>
+      <w:r>
+        <w:rPr>
+          <w:lang w:val="en-US"/>
+        </w:rPr>
+        <w:t>4</w:t>
+      </w:r>
+      <w:r>
+        <w:rPr>
+          <w:lang w:val="en-US"/>
+        </w:rPr>
+        <w:t xml:space="preserve">] </w:t>
+      </w:r>
+      <w:r>
+        <w:rPr>
+          <w:lang w:val="en-US"/>
+        </w:rPr>
+        <w:t>An application runs on an Amazon EC2 instance in a VPC. The application processes logs that are stored in an Amazon S3 bucket. The EC2 instance needs to access the S3 bucket without connectivity to the internet.</w:t>
+      </w:r>
+    </w:p>
+    <w:p>
+      <w:pPr>
+        <w:rPr>
+          <w:lang w:val="en-US"/>
+        </w:rPr>
+      </w:pPr>
+      <w:r>
+        <w:rPr>
+          <w:lang w:val="en-US"/>
+        </w:rPr>
+        <w:t>Which solution will provide private network connectivity to Amazon S3?</w:t>
+      </w:r>
+    </w:p>
+    <w:p>
+      <w:pPr>
+        <w:rPr>
+          <w:lang w:val="en-US"/>
+        </w:rPr>
+      </w:pPr>
+    </w:p>
+    <w:p>
+      <w:pPr>
+        <w:rPr>
+          <w:lang w:val="en-US"/>
+        </w:rPr>
+      </w:pPr>
+      <w:r>
+        <w:rPr>
+          <w:lang w:val="en-US"/>
+        </w:rPr>
+        <w:t>A. Create a gateway VPC endpoint to the S3 bucket.</w:t>
+      </w:r>
+    </w:p>
+    <w:p>
+      <w:pPr>
+        <w:rPr>
+          <w:lang w:val="en-US"/>
+        </w:rPr>
+      </w:pPr>
+    </w:p>
+    <w:p>
+      <w:pPr>
+        <w:rPr>
+          <w:lang w:val="en-US"/>
+        </w:rPr>
+      </w:pPr>
+      <w:r>
+        <w:rPr>
+          <w:lang w:val="en-US"/>
+        </w:rPr>
+        <w:t>Keywords:</w:t>
+      </w:r>
+    </w:p>
+    <w:p>
+      <w:pPr>
+        <w:rPr>
+          <w:lang w:val="en-US"/>
+        </w:rPr>
+      </w:pPr>
+      <w:r>
+        <w:rPr>
+          <w:lang w:val="en-US"/>
+        </w:rPr>
+        <w:t xml:space="preserve"> </w:t>
+      </w:r>
+      <w:r>
+        <w:rPr>
+          <w:lang w:val="en-US"/>
+        </w:rPr>
+        <w:t>- EC2 in VPC</w:t>
+      </w:r>
+    </w:p>
+    <w:p>
+      <w:pPr>
+        <w:rPr>
+          <w:lang w:val="en-US"/>
+        </w:rPr>
+      </w:pPr>
+      <w:r>
+        <w:rPr>
+          <w:lang w:val="en-US"/>
+        </w:rPr>
+        <w:t>- EC2 instance needs to access the S3 bucket without connectivity to the internet</w:t>
+      </w:r>
+    </w:p>
+    <w:p>
+      <w:pPr>
+        <w:rPr>
+          <w:lang w:val="en-US"/>
+        </w:rPr>
+      </w:pPr>
+      <w:r>
+        <w:rPr>
+          <w:lang w:val="en-US"/>
+        </w:rPr>
+        <w:t>VPC endpoint allows you to connect to AWS services using a private network instead of using the public Internet.</w:t>
+      </w:r>
+    </w:p>
+    <w:p>
+      <w:pPr>
+        <w:rPr>
+          <w:lang w:val="en-US"/>
+        </w:rPr>
+      </w:pPr>
+    </w:p>
+    <w:p>
+      <w:pPr>
+        <w:rPr>
+          <w:lang w:val="en-US"/>
+        </w:rPr>
+      </w:pPr>
+      <w:r>
+        <w:rPr>
+          <w:lang w:val="en-US"/>
+        </w:rPr>
+        <w:t>With a gateway endpoint, you can access Amazon S3 from your VPC, without requiring an internet gateway or NAT device for your VPC, and with no additional cost. However, gateway endpoints do not allow access from on-premises networks, from peered VPCs in other AWS Regions, or through a transit gateway.</w:t>
+      </w:r>
+    </w:p>
+    <w:p>
+      <w:pPr>
+        <w:rPr>
+          <w:lang w:val="en-US"/>
+        </w:rPr>
+      </w:pPr>
+      <w:r>
+        <w:rPr>
+          <w:lang w:val="en-US"/>
+        </w:rPr>
+        <w:t>-------------------------------------------------</w:t>
+      </w:r>
+    </w:p>
+    <w:p>
+      <w:pPr>
+        <w:rPr>
+          <w:lang w:val="en-US"/>
+        </w:rPr>
+      </w:pPr>
+    </w:p>
+    <w:p>
+      <w:pPr>
+        <w:rPr>
+          <w:lang w:val="en-US"/>
+        </w:rPr>
+      </w:pPr>
+      <w:r>
+        <w:rPr>
+          <w:lang w:val="en-US"/>
+        </w:rPr>
+        <w:t>5</w:t>
+      </w:r>
+      <w:r>
+        <w:rPr>
+          <w:lang w:val="en-US"/>
+        </w:rPr>
+        <w:t xml:space="preserve">] </w:t>
+      </w:r>
+      <w:r>
+        <w:rPr>
+          <w:lang w:val="en-US"/>
+        </w:rPr>
+        <w:t xml:space="preserve">A company is hosting a web application on AWS using a single Amazon EC2 instance that stores user-uploaded documents in an Amazon EBS volume. For better scalability and availability, the company duplicated the architecture and created a second EC2 instance and EBS volume in another Availability Zone, placing both behind an Application Load Balancer. After completing this change, users reported that, each time they refreshed the website, they could see one subset of their documents or the other, but never </w:t>
+      </w:r>
+      <w:proofErr w:type="gramStart"/>
+      <w:r>
+        <w:rPr>
+          <w:lang w:val="en-US"/>
+        </w:rPr>
+        <w:t>all of</w:t>
+      </w:r>
+      <w:proofErr w:type="gramEnd"/>
+      <w:r>
+        <w:rPr>
+          <w:lang w:val="en-US"/>
+        </w:rPr>
+        <w:t xml:space="preserve"> the documents at the same time.</w:t>
+      </w:r>
+    </w:p>
+    <w:p>
+      <w:pPr>
+        <w:rPr>
+          <w:lang w:val="en-US"/>
+        </w:rPr>
+      </w:pPr>
+      <w:r>
+        <w:rPr>
+          <w:lang w:val="en-US"/>
+        </w:rPr>
         <w:t xml:space="preserve">What </w:t>
       </w:r>
       <w:proofErr w:type="gramStart"/>
@@ -466,96 +990,101 @@
         <w:rPr>
           <w:lang w:val="en-US"/>
         </w:rPr>
-        <w:t>should the solutions</w:t>
+        <w:t>should a solutions</w:t>
       </w:r>
       <w:proofErr w:type="gramEnd"/>
       <w:r>
         <w:rPr>
           <w:lang w:val="en-US"/>
         </w:rPr>
-        <w:t xml:space="preserve"> architect do to meet these requirements with the LEAST amount of operational overhead?</w:t>
-      </w:r>
-    </w:p>
-    <w:p>
-      <w:pPr>
-        <w:rPr>
-          <w:lang w:val="en-US"/>
-        </w:rPr>
-      </w:pPr>
-    </w:p>
-    <w:p>
-      <w:pPr>
-        <w:rPr>
-          <w:lang w:val="en-US"/>
-        </w:rPr>
-      </w:pPr>
-      <w:proofErr w:type="spellStart"/>
-      <w:r>
-        <w:rPr>
-          <w:lang w:val="en-US"/>
-        </w:rPr>
-        <w:t>ans</w:t>
-      </w:r>
-      <w:proofErr w:type="spellEnd"/>
-      <w:r>
-        <w:rPr>
-          <w:lang w:val="en-US"/>
-        </w:rPr>
-        <w:t>-Use Amazon Athena directly with Amazon S3 to run the queries as needed.</w:t>
-      </w:r>
-    </w:p>
-    <w:p>
-      <w:pPr>
-        <w:rPr>
-          <w:lang w:val="en-US"/>
-        </w:rPr>
-      </w:pPr>
-    </w:p>
-    <w:p>
-      <w:pPr>
-        <w:rPr>
-          <w:lang w:val="en-US"/>
-        </w:rPr>
-      </w:pPr>
-      <w:r>
-        <w:rPr>
-          <w:lang w:val="en-US"/>
-        </w:rPr>
-        <w:t>Amazon Athena is an interactive query service that makes it easy to analyze data directly in Amazon Simple Storage Service (Amazon S3) using standard SQL. With a few actions in the AWS Management Console, you can point Athena at your data stored in Amazon S3 and begin using standard SQL to run ad-hoc queries and get results in seconds.</w:t>
-      </w:r>
-    </w:p>
-    <w:p>
-      <w:pPr>
-        <w:rPr>
-          <w:lang w:val="en-US"/>
-        </w:rPr>
-      </w:pPr>
-      <w:r>
-        <w:rPr>
-          <w:lang w:val="en-US"/>
-        </w:rPr>
-        <w:lastRenderedPageBreak/>
-        <w:t>---------------------------------------------------------------</w:t>
-      </w:r>
-    </w:p>
-    <w:p>
-      <w:pPr>
-        <w:rPr>
-          <w:lang w:val="en-US"/>
-        </w:rPr>
-      </w:pPr>
-    </w:p>
-    <w:p>
-      <w:pPr>
-        <w:rPr>
-          <w:lang w:val="en-US"/>
-        </w:rPr>
-      </w:pPr>
-      <w:r>
-        <w:rPr>
-          <w:lang w:val="en-US"/>
-        </w:rPr>
-        <w:t>3</w:t>
+        <w:t xml:space="preserve"> architect propose to ensure users see </w:t>
+      </w:r>
+      <w:proofErr w:type="gramStart"/>
+      <w:r>
+        <w:rPr>
+          <w:lang w:val="en-US"/>
+        </w:rPr>
+        <w:t>all of</w:t>
+      </w:r>
+      <w:proofErr w:type="gramEnd"/>
+      <w:r>
+        <w:rPr>
+          <w:lang w:val="en-US"/>
+        </w:rPr>
+        <w:t xml:space="preserve"> their documents at once?</w:t>
+      </w:r>
+    </w:p>
+    <w:p>
+      <w:pPr>
+        <w:rPr>
+          <w:lang w:val="en-US"/>
+        </w:rPr>
+      </w:pPr>
+    </w:p>
+    <w:p>
+      <w:pPr>
+        <w:rPr>
+          <w:lang w:val="en-US"/>
+        </w:rPr>
+      </w:pPr>
+      <w:r>
+        <w:rPr>
+          <w:lang w:val="en-US"/>
+        </w:rPr>
+        <w:t>C. Copy the data from both EBS volumes to Amazon EFS. Modify the application to save new documents to Amazon EFS</w:t>
+      </w:r>
+    </w:p>
+    <w:p>
+      <w:pPr>
+        <w:rPr>
+          <w:lang w:val="en-US"/>
+        </w:rPr>
+      </w:pPr>
+    </w:p>
+    <w:p>
+      <w:pPr>
+        <w:rPr>
+          <w:lang w:val="en-US"/>
+        </w:rPr>
+      </w:pPr>
+      <w:r>
+        <w:rPr>
+          <w:lang w:val="en-US"/>
+        </w:rPr>
+        <w:t>Option C, which involves copying the data to Amazon EFS and modifying the application to use Amazon EFS for document storage, is the most appropriate solution to ensure users can see all their documents at once in the duplicated architecture. Amazon EFS provides scalability, availability, and shared access, allowing both EC2 instances to access and synchronize the documents seamlessly. Unlike EBS volumes or snapshots, which cannot be shared in real time across multiple instances and Availability Zones, Amazon EFS allows both EC2 instances to access the same file system simultaneously, ensuring all users see the same set of documents regardless of which instance serves their request.</w:t>
+      </w:r>
+    </w:p>
+    <w:p>
+      <w:pPr>
+        <w:rPr>
+          <w:lang w:val="en-US"/>
+        </w:rPr>
+      </w:pPr>
+      <w:r>
+        <w:rPr>
+          <w:lang w:val="en-US"/>
+        </w:rPr>
+        <w:t>-------------------------------------------------------------------------------------</w:t>
+      </w:r>
+    </w:p>
+    <w:p>
+      <w:pPr>
+        <w:rPr>
+          <w:lang w:val="en-US"/>
+        </w:rPr>
+      </w:pPr>
+    </w:p>
+    <w:p>
+      <w:pPr>
+        <w:rPr>
+          <w:lang w:val="en-US"/>
+        </w:rPr>
+      </w:pPr>
+      <w:r>
+        <w:rPr>
+          <w:lang w:val="en-US"/>
+        </w:rPr>
+        <w:t>6</w:t>
       </w:r>
       <w:r>
         <w:rPr>
@@ -567,612 +1096,887 @@
         <w:rPr>
           <w:lang w:val="en-US"/>
         </w:rPr>
-        <w:t xml:space="preserve">A company uses AWS Organizations to manage multiple AWS accounts for different departments. The management account has an Amazon S3 bucket that contains project reports. The company wants to limit access to this S3 bucket to only users of accounts within the organization </w:t>
+        <w:t xml:space="preserve">A company uses NFS to store large video files in on-premises network attached storage. Each video file ranges in size from 1 MB to 500 GB. The total storage is 70 TB and is no longer growing. The company </w:t>
       </w:r>
       <w:proofErr w:type="gramStart"/>
       <w:r>
         <w:rPr>
           <w:lang w:val="en-US"/>
         </w:rPr>
-        <w:t>in</w:t>
+        <w:t>decides</w:t>
       </w:r>
       <w:proofErr w:type="gramEnd"/>
       <w:r>
         <w:rPr>
           <w:lang w:val="en-US"/>
         </w:rPr>
-        <w:t xml:space="preserve"> AWS Organizations.</w:t>
-      </w:r>
-    </w:p>
-    <w:p>
-      <w:pPr>
-        <w:rPr>
-          <w:lang w:val="en-US"/>
-        </w:rPr>
-      </w:pPr>
-      <w:r>
-        <w:rPr>
-          <w:lang w:val="en-US"/>
-        </w:rPr>
-        <w:t>Which solution meets these requirements with the LEAST amount of operational overhead?</w:t>
-      </w:r>
-    </w:p>
-    <w:p>
-      <w:pPr>
-        <w:rPr>
-          <w:lang w:val="en-US"/>
-        </w:rPr>
-      </w:pPr>
-    </w:p>
-    <w:p>
-      <w:pPr>
-        <w:rPr>
-          <w:lang w:val="en-US"/>
-        </w:rPr>
-      </w:pPr>
-      <w:proofErr w:type="spellStart"/>
-      <w:r>
-        <w:rPr>
-          <w:lang w:val="en-US"/>
-        </w:rPr>
-        <w:t>ans</w:t>
-      </w:r>
-      <w:proofErr w:type="spellEnd"/>
-      <w:r>
-        <w:rPr>
-          <w:lang w:val="en-US"/>
-        </w:rPr>
-        <w:t xml:space="preserve">-. Add the </w:t>
-      </w:r>
-      <w:proofErr w:type="spellStart"/>
-      <w:r>
-        <w:rPr>
-          <w:lang w:val="en-US"/>
-        </w:rPr>
-        <w:t>aws</w:t>
-      </w:r>
-      <w:proofErr w:type="spellEnd"/>
-      <w:r>
-        <w:rPr>
-          <w:lang w:val="en-US"/>
-        </w:rPr>
-        <w:t xml:space="preserve"> </w:t>
-      </w:r>
-      <w:proofErr w:type="spellStart"/>
-      <w:r>
-        <w:rPr>
-          <w:lang w:val="en-US"/>
-        </w:rPr>
-        <w:t>PrincipalOrgID</w:t>
-      </w:r>
-      <w:proofErr w:type="spellEnd"/>
-      <w:r>
-        <w:rPr>
-          <w:lang w:val="en-US"/>
-        </w:rPr>
-        <w:t xml:space="preserve"> global condition key with a reference to the organization ID to the S3 bucket policy.</w:t>
-      </w:r>
-    </w:p>
-    <w:p>
-      <w:pPr>
-        <w:rPr>
-          <w:lang w:val="en-US"/>
-        </w:rPr>
-      </w:pPr>
-    </w:p>
-    <w:p>
-      <w:pPr>
-        <w:rPr>
-          <w:lang w:val="en-US"/>
-        </w:rPr>
-      </w:pPr>
-      <w:proofErr w:type="spellStart"/>
+        <w:t xml:space="preserve"> to migrate the video files to Amazon S3. The company must migrate the video files as soon as possible while using the least possible network bandwidth.</w:t>
+      </w:r>
+    </w:p>
+    <w:p>
+      <w:pPr>
+        <w:rPr>
+          <w:lang w:val="en-US"/>
+        </w:rPr>
+      </w:pPr>
+      <w:r>
+        <w:rPr>
+          <w:lang w:val="en-US"/>
+        </w:rPr>
+        <w:t>Which solution will meet these requirements?</w:t>
+      </w:r>
+    </w:p>
+    <w:p>
+      <w:pPr>
+        <w:rPr>
+          <w:lang w:val="en-US"/>
+        </w:rPr>
+      </w:pPr>
+    </w:p>
+    <w:p>
+      <w:pPr>
+        <w:rPr>
+          <w:lang w:val="en-US"/>
+        </w:rPr>
+      </w:pPr>
+      <w:r>
+        <w:rPr>
+          <w:lang w:val="en-US"/>
+        </w:rPr>
+        <w:t xml:space="preserve">  B Create an AWS Snowball Edge job. Receive a Snowball Edge device on premises. Use the Snowball Edge client to transfer data to the device. Return the device so that AWS can import the data into Amazon S3</w:t>
+      </w:r>
+    </w:p>
+    <w:p>
+      <w:pPr>
+        <w:rPr>
+          <w:lang w:val="en-US"/>
+        </w:rPr>
+      </w:pPr>
+    </w:p>
+    <w:p>
+      <w:pPr>
+        <w:rPr>
+          <w:lang w:val="en-US"/>
+        </w:rPr>
+      </w:pPr>
+      <w:r>
+        <w:rPr>
+          <w:lang w:val="en-US"/>
+        </w:rPr>
+        <w:t xml:space="preserve"> On a Snowball Edge device you can copy files with a speed of up to 100Gbps. 70TB will take around 5600 seconds, so very quickly, less than 2 hours. The downside is that it'll take between 4-6 working days to receive the device and then another 2-3 working days to send it back and for AWS to move the data onto S3 once it reaches them. Total time: 6-9 working days. Bandwidth used: 0.</w:t>
+      </w:r>
+    </w:p>
+    <w:p>
+      <w:pPr>
+        <w:rPr>
+          <w:lang w:val="en-US"/>
+        </w:rPr>
+      </w:pPr>
+      <w:r>
+        <w:rPr>
+          <w:lang w:val="en-US"/>
+        </w:rPr>
+        <w:t>---------------------------------------------------------</w:t>
+      </w:r>
+    </w:p>
+    <w:p>
+      <w:pPr>
+        <w:rPr>
+          <w:lang w:val="en-US"/>
+        </w:rPr>
+      </w:pPr>
+    </w:p>
+    <w:p>
+      <w:pPr>
+        <w:rPr>
+          <w:lang w:val="en-US"/>
+        </w:rPr>
+      </w:pPr>
+      <w:r>
+        <w:rPr>
+          <w:lang w:val="en-US"/>
+        </w:rPr>
+        <w:t>7] A company has an application that ingests incoming messages. Dozens of other applications and microservices then quickly consume these messages. The number of messages varies drastically and sometimes increases suddenly to 100,000 each second. The company wants to decouple the solution and increase scalability.</w:t>
+      </w:r>
+    </w:p>
+    <w:p>
+      <w:pPr>
+        <w:rPr>
+          <w:lang w:val="en-US"/>
+        </w:rPr>
+      </w:pPr>
+      <w:r>
+        <w:rPr>
+          <w:lang w:val="en-US"/>
+        </w:rPr>
+        <w:t>Which solution meets these requirements?</w:t>
+      </w:r>
+    </w:p>
+    <w:p>
+      <w:pPr>
+        <w:rPr>
+          <w:lang w:val="en-US"/>
+        </w:rPr>
+      </w:pPr>
+    </w:p>
+    <w:p>
+      <w:pPr>
+        <w:rPr>
+          <w:lang w:val="en-US"/>
+        </w:rPr>
+      </w:pPr>
+      <w:r>
+        <w:rPr>
+          <w:lang w:val="en-US"/>
+        </w:rPr>
+        <w:t xml:space="preserve">D. Publish the messages to an Amazon Simple Notification Service (Amazon SNS) topic with multiple Amazon Simple Queue Service (Amazon SQS) subscriptions. Configure the consumer applications to process the messages from the queues. </w:t>
+      </w:r>
+    </w:p>
+    <w:p>
+      <w:pPr>
+        <w:rPr>
+          <w:lang w:val="en-US"/>
+        </w:rPr>
+      </w:pPr>
+    </w:p>
+    <w:p>
+      <w:pPr>
+        <w:rPr>
+          <w:lang w:val="en-US"/>
+        </w:rPr>
+      </w:pPr>
+      <w:r>
+        <w:rPr>
+          <w:lang w:val="en-US"/>
+        </w:rPr>
+        <w:t>A good practice is to also add message attributes when publishing to SNS. Each SQS subscription can have a filter policy that matches only the messages it cares about, so that only relevant messages are delivered to each SQS queue, and consumers only see/process what they need.</w:t>
+      </w:r>
+    </w:p>
+    <w:p>
+      <w:pPr>
+        <w:rPr>
+          <w:lang w:val="en-US"/>
+        </w:rPr>
+      </w:pPr>
+    </w:p>
+    <w:p>
+      <w:pPr>
+        <w:rPr>
+          <w:lang w:val="en-US"/>
+        </w:rPr>
+      </w:pPr>
       <w:proofErr w:type="gramStart"/>
       <w:r>
         <w:rPr>
           <w:lang w:val="en-US"/>
         </w:rPr>
-        <w:t>aws:PrincipalOrgID</w:t>
-      </w:r>
-      <w:proofErr w:type="spellEnd"/>
+        <w:t>an</w:t>
+      </w:r>
       <w:proofErr w:type="gramEnd"/>
       <w:r>
         <w:rPr>
           <w:lang w:val="en-US"/>
         </w:rPr>
-        <w:t xml:space="preserve"> – </w:t>
-      </w:r>
-      <w:r>
-        <w:rPr>
-          <w:b/>
-          <w:bCs/>
-          <w:highlight w:val="green"/>
-          <w:lang w:val="en-US"/>
-        </w:rPr>
-        <w:t>Simplifies specifying</w:t>
-      </w:r>
-      <w:r>
-        <w:rPr>
-          <w:lang w:val="en-US"/>
-        </w:rPr>
-        <w:t xml:space="preserve"> the </w:t>
+        <w:t xml:space="preserve"> SQS queue can handle a maximum of 3,000 messages per second. However, you can request higher throughput by contacting AWS Support. AWS can increase the message throughput for your queue beyond the default limits in increments of 300 messages per second, up to a maximum of 10,000 messages per second.</w:t>
+      </w:r>
+    </w:p>
+    <w:p>
+      <w:pPr>
+        <w:rPr>
+          <w:lang w:val="en-US"/>
+        </w:rPr>
+      </w:pPr>
+    </w:p>
+    <w:p>
+      <w:pPr>
+        <w:rPr>
+          <w:lang w:val="en-US"/>
+        </w:rPr>
+      </w:pPr>
+      <w:r>
+        <w:rPr>
+          <w:lang w:val="en-US"/>
+        </w:rPr>
+        <w:t>It's important to note that the maximum number of messages per second that a queue can handle is not the same as the maximum number of requests per second that the SQS API can handle. The SQS API is designed to handle a high volume of requests per second, so it can be used to send messages to your queue at a rate that exceeds the maximum message throughput of the queue.</w:t>
+      </w:r>
+    </w:p>
+    <w:p>
+      <w:pPr>
+        <w:rPr>
+          <w:lang w:val="en-US"/>
+        </w:rPr>
+      </w:pPr>
+      <w:r>
+        <w:rPr>
+          <w:lang w:val="en-US"/>
+        </w:rPr>
+        <w:t>--------------------------------------------------------------------------------------------------------------</w:t>
+      </w:r>
+    </w:p>
+    <w:p>
+      <w:pPr>
+        <w:rPr>
+          <w:lang w:val="en-US"/>
+        </w:rPr>
+      </w:pPr>
+      <w:r>
+        <w:rPr>
+          <w:lang w:val="en-US"/>
+        </w:rPr>
+        <w:t>8] A company is migrating a distributed application to AWS. The application serves variable workloads. The legacy platform consists of a primary server that coordinates jobs across multiple compute nodes. The company wants to modernize the application with a solution that maximizes resiliency and scalability.</w:t>
+      </w:r>
+    </w:p>
+    <w:p>
+      <w:pPr>
+        <w:rPr>
+          <w:lang w:val="en-US"/>
+        </w:rPr>
+      </w:pPr>
+      <w:r>
+        <w:rPr>
+          <w:lang w:val="en-US"/>
+        </w:rPr>
+        <w:t>How should a solutions architect design the architecture to meet these requirements?</w:t>
+      </w:r>
+    </w:p>
+    <w:p>
+      <w:pPr>
+        <w:rPr>
+          <w:lang w:val="en-US"/>
+        </w:rPr>
+      </w:pPr>
+    </w:p>
+    <w:p>
+      <w:pPr>
+        <w:rPr>
+          <w:lang w:val="en-US"/>
+        </w:rPr>
+      </w:pPr>
+      <w:r>
+        <w:rPr>
+          <w:lang w:val="en-US"/>
+        </w:rPr>
+        <w:t>B. Configure an Amazon Simple Queue Service (Amazon SQS) queue as a destination for the jobs. Implement the compute nodes with Amazon EC2 instances that are managed in an Auto Scaling group. Configure EC2 Auto Scaling based on the size of the queue.</w:t>
+      </w:r>
+    </w:p>
+    <w:p>
+      <w:pPr>
+        <w:rPr>
+          <w:lang w:val="en-US"/>
+        </w:rPr>
+      </w:pPr>
+    </w:p>
+    <w:p>
+      <w:pPr>
+        <w:rPr>
+          <w:lang w:val="en-US"/>
+        </w:rPr>
+      </w:pPr>
+      <w:r>
+        <w:rPr>
+          <w:lang w:val="en-US"/>
+        </w:rPr>
+        <w:t xml:space="preserve">Option B: This option provides a decoupled architecture where the jobs are sent to an SQS queue. The </w:t>
       </w:r>
       <w:proofErr w:type="gramStart"/>
       <w:r>
         <w:rPr>
-          <w:b/>
-          <w:bCs/>
-          <w:highlight w:val="green"/>
-          <w:lang w:val="en-US"/>
-        </w:rPr>
-        <w:t>Principal</w:t>
+          <w:lang w:val="en-US"/>
+        </w:rPr>
+        <w:t>compute</w:t>
       </w:r>
       <w:proofErr w:type="gramEnd"/>
       <w:r>
         <w:rPr>
           <w:lang w:val="en-US"/>
         </w:rPr>
-        <w:t xml:space="preserve"> element in a resource-based policy. This global key provides an alternative to listing all the account IDs for all AWS accounts in an organization. Instead of listing </w:t>
+        <w:t xml:space="preserve"> nodes (EC2 instances in an Auto Scaling group) can then process these jobs. Scaling based on the size of the SQS queue (the number of messages) allows the architecture to adapt to variable workloads, scaling out when the queue depth increases and scaling in when the depth decreases.</w:t>
+      </w:r>
+    </w:p>
+    <w:p>
+      <w:pPr>
+        <w:rPr>
+          <w:lang w:val="en-US"/>
+        </w:rPr>
+      </w:pPr>
+      <w:r>
+        <w:rPr>
+          <w:lang w:val="en-US"/>
+        </w:rPr>
+        <w:t>----------------------------------------------------------------</w:t>
+      </w:r>
+    </w:p>
+    <w:p>
+      <w:pPr>
+        <w:rPr>
+          <w:lang w:val="en-US"/>
+        </w:rPr>
+      </w:pPr>
+    </w:p>
+    <w:p>
+      <w:pPr>
+        <w:rPr>
+          <w:lang w:val="en-US"/>
+        </w:rPr>
+      </w:pPr>
+      <w:r>
+        <w:rPr>
+          <w:lang w:val="en-US"/>
+        </w:rPr>
+        <w:t>9] A company is running an SMB file server in its data center. The file server stores large files that are accessed frequently for the first few days after the files are created. After 7 days the files are rarely accessed.</w:t>
+      </w:r>
+    </w:p>
+    <w:p>
+      <w:pPr>
+        <w:rPr>
+          <w:lang w:val="en-US"/>
+        </w:rPr>
+      </w:pPr>
+      <w:r>
+        <w:rPr>
+          <w:lang w:val="en-US"/>
+        </w:rPr>
+        <w:t>The total data size is increasing and is close to the company's total storage capacity. A solutions architect must increase the company's available storage space without losing low-latency access to the most recently accessed files. The solutions architect must also provide file lifecycle management to avoid future storage issues.</w:t>
+      </w:r>
+    </w:p>
+    <w:p>
+      <w:pPr>
+        <w:rPr>
+          <w:lang w:val="en-US"/>
+        </w:rPr>
+      </w:pPr>
+      <w:r>
+        <w:rPr>
+          <w:lang w:val="en-US"/>
+        </w:rPr>
+        <w:t>Which solution will meet these requirements?</w:t>
+      </w:r>
+    </w:p>
+    <w:p>
+      <w:pPr>
+        <w:rPr>
+          <w:lang w:val="en-US"/>
+        </w:rPr>
+      </w:pPr>
+    </w:p>
+    <w:p>
+      <w:pPr>
+        <w:rPr>
+          <w:lang w:val="en-US"/>
+        </w:rPr>
+      </w:pPr>
+      <w:r>
+        <w:rPr>
+          <w:lang w:val="en-US"/>
+        </w:rPr>
+        <w:t>B. Create an Amazon S3 File Gateway to extend the company's storage space. Create an S3 Lifecycle policy to transition the data to S3 Glacier Deep Archive after 7 days.</w:t>
+      </w:r>
+    </w:p>
+    <w:p>
+      <w:pPr>
+        <w:rPr>
+          <w:lang w:val="en-US"/>
+        </w:rPr>
+      </w:pPr>
+    </w:p>
+    <w:p>
+      <w:pPr>
+        <w:rPr>
+          <w:lang w:val="en-US"/>
+        </w:rPr>
+      </w:pPr>
+      <w:r>
+        <w:rPr>
+          <w:lang w:val="en-US"/>
+        </w:rPr>
+        <w:t>Option B: Amazon S3 File Gateway provides a hybrid cloud storage solution, integrating on-premises environments with cloud storage. Files written to the file share are automatically saved as S3 objects. With S3 Lifecycle policies, you can transition objects between storage classes. Transitioning to Glacier Deep Archive is suitable for rarely accessed files. This solution addresses both the storage capacity and lifecycle management requirements.</w:t>
+      </w:r>
+    </w:p>
+    <w:p>
+      <w:pPr>
+        <w:rPr>
+          <w:lang w:val="en-US"/>
+        </w:rPr>
+      </w:pPr>
+      <w:r>
+        <w:rPr>
+          <w:lang w:val="en-US"/>
+        </w:rPr>
+        <w:t>---------------------------------------------------------------------</w:t>
+      </w:r>
+    </w:p>
+    <w:p>
+      <w:pPr>
+        <w:rPr>
+          <w:lang w:val="en-US"/>
+        </w:rPr>
+      </w:pPr>
+    </w:p>
+    <w:p>
+      <w:pPr>
+        <w:rPr>
+          <w:lang w:val="en-US"/>
+        </w:rPr>
+      </w:pPr>
+      <w:r>
+        <w:rPr>
+          <w:lang w:val="en-US"/>
+        </w:rPr>
+        <w:t>10] A company is building an ecommerce web application on AWS. The application sends information about new orders to an Amazon API Gateway REST API to process. The company wants to ensure that orders are processed in the order that they are received.</w:t>
+      </w:r>
+    </w:p>
+    <w:p>
+      <w:pPr>
+        <w:rPr>
+          <w:lang w:val="en-US"/>
+        </w:rPr>
+      </w:pPr>
+      <w:r>
+        <w:rPr>
+          <w:lang w:val="en-US"/>
+        </w:rPr>
+        <w:t>Which solution will meet these requirements?</w:t>
+      </w:r>
+    </w:p>
+    <w:p>
+      <w:pPr>
+        <w:rPr>
+          <w:lang w:val="en-US"/>
+        </w:rPr>
+      </w:pPr>
+    </w:p>
+    <w:p>
+      <w:pPr>
+        <w:rPr>
+          <w:lang w:val="en-US"/>
+        </w:rPr>
+      </w:pPr>
+      <w:r>
+        <w:rPr>
+          <w:lang w:val="en-US"/>
+        </w:rPr>
+        <w:t>B. Use an API Gateway integration to send a message to an Amazon Simple Queue Service (Amazon SQS) FIFO queue when the application receives an order. Configure the SQS FIFO queue to invoke an AWS Lambda function for processing</w:t>
+      </w:r>
+    </w:p>
+    <w:p>
+      <w:pPr>
+        <w:rPr>
+          <w:lang w:val="en-US"/>
+        </w:rPr>
+      </w:pPr>
+    </w:p>
+    <w:p>
+      <w:pPr>
+        <w:rPr>
+          <w:lang w:val="en-US"/>
+        </w:rPr>
+      </w:pPr>
+      <w:r>
+        <w:rPr>
+          <w:lang w:val="en-US"/>
+        </w:rPr>
+        <w:t>Use an API Gateway integration to send a message to an Amazon Simple Queue Service (Amazon SQS) FIFO queue when the application receives an order. Configure the SQS FIFO queue to invoke an AWS Lambda function for processing.</w:t>
+      </w:r>
+    </w:p>
+    <w:p>
+      <w:pPr>
+        <w:rPr>
+          <w:lang w:val="en-US"/>
+        </w:rPr>
+      </w:pPr>
+      <w:r>
+        <w:rPr>
+          <w:lang w:val="en-US"/>
+        </w:rPr>
+        <w:t>----------------------------------------------------------------------------------------------------------------------</w:t>
+      </w:r>
+    </w:p>
+    <w:p>
+      <w:pPr>
+        <w:rPr>
+          <w:lang w:val="en-US"/>
+        </w:rPr>
+      </w:pPr>
+    </w:p>
+    <w:p>
+      <w:pPr>
+        <w:rPr>
+          <w:lang w:val="en-US"/>
+        </w:rPr>
+      </w:pPr>
+      <w:r>
+        <w:rPr>
+          <w:lang w:val="en-US"/>
+        </w:rPr>
+        <w:t xml:space="preserve">11] A company has an application that runs on Amazon EC2 instances and uses an Amazon Aurora database. The EC2 instances connect to the database by using </w:t>
       </w:r>
       <w:proofErr w:type="gramStart"/>
       <w:r>
         <w:rPr>
           <w:lang w:val="en-US"/>
         </w:rPr>
-        <w:t>all of</w:t>
+        <w:t>user names</w:t>
       </w:r>
       <w:proofErr w:type="gramEnd"/>
       <w:r>
         <w:rPr>
           <w:lang w:val="en-US"/>
         </w:rPr>
-        <w:t xml:space="preserve"> the accounts that are members of an organization, you can specify the organization ID in the Condition element.</w:t>
-      </w:r>
-    </w:p>
-    <w:p>
-      <w:pPr>
-        <w:rPr>
-          <w:lang w:val="en-US"/>
-        </w:rPr>
-      </w:pPr>
-      <w:r>
-        <w:rPr>
-          <w:lang w:val="en-US"/>
-        </w:rPr>
-        <w:t xml:space="preserve">proposes adding the </w:t>
-      </w:r>
-      <w:proofErr w:type="spellStart"/>
-      <w:r>
-        <w:rPr>
-          <w:lang w:val="en-US"/>
-        </w:rPr>
-        <w:t>aws</w:t>
-      </w:r>
-      <w:proofErr w:type="spellEnd"/>
-      <w:r>
-        <w:rPr>
-          <w:lang w:val="en-US"/>
-        </w:rPr>
-        <w:t xml:space="preserve"> </w:t>
-      </w:r>
-      <w:proofErr w:type="spellStart"/>
-      <w:r>
-        <w:rPr>
-          <w:lang w:val="en-US"/>
-        </w:rPr>
-        <w:t>PrincipalOrgID</w:t>
-      </w:r>
-      <w:proofErr w:type="spellEnd"/>
-      <w:r>
-        <w:rPr>
-          <w:lang w:val="en-US"/>
-        </w:rPr>
-        <w:t xml:space="preserve"> global condition key with a reference to the organization ID to the S3 bucket policy. This would limit access to the S3 bucket to only users of accounts within the organization in AWS Organizations, as the </w:t>
-      </w:r>
-      <w:proofErr w:type="spellStart"/>
-      <w:r>
-        <w:rPr>
-          <w:lang w:val="en-US"/>
-        </w:rPr>
-        <w:t>aws</w:t>
-      </w:r>
-      <w:proofErr w:type="spellEnd"/>
-      <w:r>
-        <w:rPr>
-          <w:lang w:val="en-US"/>
-        </w:rPr>
-        <w:t xml:space="preserve"> </w:t>
-      </w:r>
-      <w:proofErr w:type="spellStart"/>
-      <w:r>
-        <w:rPr>
-          <w:lang w:val="en-US"/>
-        </w:rPr>
-        <w:t>PrincipalOrgID</w:t>
-      </w:r>
-      <w:proofErr w:type="spellEnd"/>
-      <w:r>
-        <w:rPr>
-          <w:lang w:val="en-US"/>
-        </w:rPr>
-        <w:t xml:space="preserve"> condition key can check if the request is coming from within the organization.</w:t>
-      </w:r>
-    </w:p>
-    <w:p>
-      <w:pPr>
-        <w:rPr>
-          <w:lang w:val="en-US"/>
-        </w:rPr>
-      </w:pPr>
-      <w:r>
-        <w:rPr>
-          <w:lang w:val="en-US"/>
-        </w:rPr>
-        <w:t>--------------------------------------------------------------------------</w:t>
-      </w:r>
-    </w:p>
-    <w:p>
-      <w:pPr>
-        <w:rPr>
-          <w:lang w:val="en-US"/>
-        </w:rPr>
-      </w:pPr>
-    </w:p>
-    <w:p>
-      <w:pPr>
-        <w:rPr>
-          <w:lang w:val="en-US"/>
-        </w:rPr>
-      </w:pPr>
-      <w:r>
-        <w:rPr>
-          <w:lang w:val="en-US"/>
-        </w:rPr>
-        <w:t>4</w:t>
-      </w:r>
-      <w:r>
-        <w:rPr>
-          <w:lang w:val="en-US"/>
-        </w:rPr>
-        <w:t xml:space="preserve">] </w:t>
-      </w:r>
-      <w:r>
-        <w:rPr>
-          <w:lang w:val="en-US"/>
-        </w:rPr>
-        <w:t xml:space="preserve">An application runs on an Amazon EC2 instance in a VPC. The application processes </w:t>
+        <w:t xml:space="preserve"> and passwords that are stored locally in a file. The company wants to minimize the operational overhead of credential management.</w:t>
+      </w:r>
+    </w:p>
+    <w:p>
+      <w:pPr>
+        <w:rPr>
+          <w:lang w:val="en-US"/>
+        </w:rPr>
+      </w:pPr>
+      <w:r>
+        <w:rPr>
+          <w:lang w:val="en-US"/>
+        </w:rPr>
+        <w:t>What should a solutions architect do to accomplish this goal?</w:t>
+      </w:r>
+    </w:p>
+    <w:p>
+      <w:pPr>
+        <w:rPr>
+          <w:lang w:val="en-US"/>
+        </w:rPr>
+      </w:pPr>
+    </w:p>
+    <w:p>
+      <w:pPr>
+        <w:rPr>
+          <w:lang w:val="en-US"/>
+        </w:rPr>
+      </w:pPr>
+      <w:r>
+        <w:rPr>
+          <w:lang w:val="en-US"/>
+        </w:rPr>
+        <w:t xml:space="preserve">A. Use AWS Secrets Manager and attach an IAM role that grants access to that secret to the EC2 instances that need it. Turn on automatic rotation. </w:t>
+      </w:r>
+    </w:p>
+    <w:p>
+      <w:pPr>
+        <w:rPr>
+          <w:lang w:val="en-US"/>
+        </w:rPr>
+      </w:pPr>
+    </w:p>
+    <w:p>
+      <w:pPr>
+        <w:rPr>
+          <w:lang w:val="en-US"/>
+        </w:rPr>
+      </w:pPr>
+      <w:r>
+        <w:rPr>
+          <w:lang w:val="en-US"/>
+        </w:rPr>
+        <w:t xml:space="preserve"> AWS Secrets Manager is a secrets management service that helps you protect access to your applications, services, and IT resources. This service enables you to rotate, manage, and retrieve database credentials, API keys, and other secrets throughout their lifecycle.</w:t>
+      </w:r>
+    </w:p>
+    <w:p>
+      <w:pPr>
+        <w:rPr>
+          <w:lang w:val="en-US"/>
+        </w:rPr>
+      </w:pPr>
+      <w:r>
+        <w:rPr>
+          <w:lang w:val="en-US"/>
+        </w:rPr>
+        <w:t>------------------------------------------------------------------------------------</w:t>
+      </w:r>
+    </w:p>
+    <w:p>
+      <w:pPr>
+        <w:rPr>
+          <w:lang w:val="en-US"/>
+        </w:rPr>
+      </w:pPr>
+    </w:p>
+    <w:p>
+      <w:pPr>
+        <w:rPr>
+          <w:lang w:val="en-US"/>
+        </w:rPr>
+      </w:pPr>
+      <w:r>
+        <w:rPr>
+          <w:lang w:val="en-US"/>
+        </w:rPr>
+        <w:t xml:space="preserve">12] A global company hosts its web application on Amazon EC2 instances behind an Application Load Balancer (ALB). The web application has static data and dynamic data. The company stores its static data in an Amazon S3 bucket. The company wants to improve performance and reduce latency for </w:t>
       </w:r>
       <w:proofErr w:type="gramStart"/>
       <w:r>
         <w:rPr>
           <w:lang w:val="en-US"/>
         </w:rPr>
-        <w:t>logs</w:t>
+        <w:t>the static</w:t>
       </w:r>
       <w:proofErr w:type="gramEnd"/>
       <w:r>
         <w:rPr>
           <w:lang w:val="en-US"/>
         </w:rPr>
-        <w:t xml:space="preserve"> that are stored in an Amazon S3 bucket. The EC2 instance needs to access the S3 bucket without connectivity to the internet.</w:t>
-      </w:r>
-    </w:p>
-    <w:p>
-      <w:pPr>
-        <w:rPr>
-          <w:lang w:val="en-US"/>
-        </w:rPr>
-      </w:pPr>
-      <w:r>
-        <w:rPr>
-          <w:lang w:val="en-US"/>
-        </w:rPr>
-        <w:t>Which solution will provide private network connectivity to Amazon S3?</w:t>
-      </w:r>
-    </w:p>
-    <w:p>
-      <w:pPr>
-        <w:rPr>
-          <w:lang w:val="en-US"/>
-        </w:rPr>
-      </w:pPr>
-    </w:p>
-    <w:p>
-      <w:pPr>
-        <w:rPr>
-          <w:lang w:val="en-US"/>
-        </w:rPr>
-      </w:pPr>
-      <w:r>
-        <w:rPr>
-          <w:lang w:val="en-US"/>
-        </w:rPr>
-        <w:t>A. Create a gateway VPC endpoint to the S3 bucket.</w:t>
-      </w:r>
-    </w:p>
-    <w:p>
-      <w:pPr>
-        <w:rPr>
-          <w:lang w:val="en-US"/>
-        </w:rPr>
-      </w:pPr>
-    </w:p>
-    <w:p>
-      <w:pPr>
-        <w:rPr>
-          <w:lang w:val="en-US"/>
-        </w:rPr>
-      </w:pPr>
-      <w:r>
-        <w:rPr>
-          <w:lang w:val="en-US"/>
-        </w:rPr>
-        <w:t>Keywords:</w:t>
-      </w:r>
-    </w:p>
-    <w:p>
-      <w:pPr>
-        <w:rPr>
-          <w:lang w:val="en-US"/>
-        </w:rPr>
-      </w:pPr>
-      <w:r>
-        <w:rPr>
-          <w:lang w:val="en-US"/>
-        </w:rPr>
-        <w:t>- EC2 in VPC</w:t>
-      </w:r>
-    </w:p>
-    <w:p>
-      <w:pPr>
-        <w:rPr>
-          <w:lang w:val="en-US"/>
-        </w:rPr>
-      </w:pPr>
-      <w:r>
-        <w:rPr>
-          <w:lang w:val="en-US"/>
-        </w:rPr>
-        <w:t>- EC2 instance needs to access the S3 bucket without connectivity to the internet</w:t>
-      </w:r>
-    </w:p>
-    <w:p>
-      <w:pPr>
-        <w:rPr>
-          <w:lang w:val="en-US"/>
-        </w:rPr>
-      </w:pPr>
-      <w:r>
-        <w:rPr>
-          <w:lang w:val="en-US"/>
-        </w:rPr>
-        <w:t>VPC endpoint allows you to connect to AWS services using a private network instead of using the public Internet.</w:t>
-      </w:r>
-    </w:p>
-    <w:p>
-      <w:pPr>
-        <w:rPr>
-          <w:lang w:val="en-US"/>
-        </w:rPr>
-      </w:pPr>
-    </w:p>
-    <w:p>
-      <w:pPr>
-        <w:rPr>
-          <w:lang w:val="en-US"/>
-        </w:rPr>
-      </w:pPr>
-      <w:r>
-        <w:rPr>
-          <w:lang w:val="en-US"/>
-        </w:rPr>
-        <w:t>With a gateway endpoint, you can access Amazon S3 from your VPC, without requiring an internet gateway or NAT device for your VPC, and with no additional cost. However, gateway endpoints do not allow access from on-premises networks, from peered VPCs in other AWS Regions, or through a transit gateway.</w:t>
-      </w:r>
-    </w:p>
-    <w:p>
-      <w:pPr>
-        <w:rPr>
-          <w:lang w:val="en-US"/>
-        </w:rPr>
-      </w:pPr>
-      <w:r>
-        <w:rPr>
-          <w:lang w:val="en-US"/>
-        </w:rPr>
-        <w:t>-------------------------------------------------</w:t>
-      </w:r>
-    </w:p>
-    <w:p>
-      <w:pPr>
-        <w:rPr>
-          <w:lang w:val="en-US"/>
-        </w:rPr>
-      </w:pPr>
-    </w:p>
-    <w:p>
-      <w:pPr>
-        <w:rPr>
-          <w:lang w:val="en-US"/>
-        </w:rPr>
-      </w:pPr>
-      <w:r>
-        <w:rPr>
-          <w:lang w:val="en-US"/>
-        </w:rPr>
-        <w:t>5</w:t>
-      </w:r>
-      <w:r>
-        <w:rPr>
-          <w:lang w:val="en-US"/>
-        </w:rPr>
-        <w:t xml:space="preserve">] </w:t>
-      </w:r>
-      <w:r>
-        <w:rPr>
-          <w:lang w:val="en-US"/>
-        </w:rPr>
-        <w:t xml:space="preserve">A company is hosting a web application on AWS using a single Amazon EC2 instance that stores user-uploaded documents in an Amazon EBS volume. For better scalability and availability, the company duplicated </w:t>
-      </w:r>
-      <w:r>
-        <w:rPr>
-          <w:lang w:val="en-US"/>
-        </w:rPr>
-        <w:lastRenderedPageBreak/>
-        <w:t xml:space="preserve">the architecture and created a second EC2 instance and EBS volume in another Availability Zone, placing both behind an Application Load Balancer. After completing this change, users reported that, each time they refreshed the website, they could see one subset of their documents or the other, but never </w:t>
+        <w:t xml:space="preserve"> data and dynamic data. The company is using its own domain name registered with Amazon Route 53.</w:t>
+      </w:r>
+    </w:p>
+    <w:p>
+      <w:pPr>
+        <w:rPr>
+          <w:lang w:val="en-US"/>
+        </w:rPr>
+      </w:pPr>
+      <w:r>
+        <w:rPr>
+          <w:lang w:val="en-US"/>
+        </w:rPr>
+        <w:t>What should a solutions architect do to meet these requirements?</w:t>
+      </w:r>
+    </w:p>
+    <w:p>
+      <w:pPr>
+        <w:rPr>
+          <w:lang w:val="en-US"/>
+        </w:rPr>
+      </w:pPr>
+    </w:p>
+    <w:p>
+      <w:pPr>
+        <w:rPr>
+          <w:lang w:val="en-US"/>
+        </w:rPr>
+      </w:pPr>
+      <w:r>
+        <w:rPr>
+          <w:lang w:val="en-US"/>
+        </w:rPr>
+        <w:t>A. Create an Amazon CloudFront distribution that has the S3 bucket and the ALB as origins. Configure Route 53 to route traffic to the CloudFront distribution.</w:t>
+      </w:r>
+    </w:p>
+    <w:p>
+      <w:pPr>
+        <w:rPr>
+          <w:lang w:val="en-US"/>
+        </w:rPr>
+      </w:pPr>
+    </w:p>
+    <w:p>
+      <w:pPr>
+        <w:rPr>
+          <w:lang w:val="en-US"/>
+        </w:rPr>
+      </w:pPr>
+      <w:r>
+        <w:rPr>
+          <w:lang w:val="en-US"/>
+        </w:rPr>
+        <w:t xml:space="preserve">CloudFront with Multiple Origins: CloudFront allows you to set up multiple origins for your distribution, so you can use both the ALB (for dynamic content) and the S3 bucket (for static content) as origins. This means that both your dynamic and static content can be served through CloudFront, which will </w:t>
       </w:r>
       <w:proofErr w:type="gramStart"/>
       <w:r>
         <w:rPr>
           <w:lang w:val="en-US"/>
         </w:rPr>
-        <w:t>all of</w:t>
+        <w:t>cache</w:t>
       </w:r>
       <w:proofErr w:type="gramEnd"/>
       <w:r>
         <w:rPr>
           <w:lang w:val="en-US"/>
         </w:rPr>
-        <w:t xml:space="preserve"> the documents at the same time.</w:t>
-      </w:r>
-    </w:p>
-    <w:p>
-      <w:pPr>
-        <w:rPr>
-          <w:lang w:val="en-US"/>
-        </w:rPr>
-      </w:pPr>
-      <w:r>
-        <w:rPr>
-          <w:lang w:val="en-US"/>
-        </w:rPr>
-        <w:t xml:space="preserve">What </w:t>
+        <w:t xml:space="preserve"> content at edge locations to reduce latency.</w:t>
+      </w:r>
+    </w:p>
+    <w:p>
+      <w:pPr>
+        <w:rPr>
+          <w:lang w:val="en-US"/>
+        </w:rPr>
+      </w:pPr>
+      <w:r>
+        <w:rPr>
+          <w:lang w:val="en-US"/>
+        </w:rPr>
+        <w:t>Route 53 Integration with CloudFront: Amazon Route 53 can be easily configured to route traffic for your domain to a CloudFront distribution. Users will access your domain, and Route 53 will direct them to the nearest CloudFront edge location.</w:t>
+      </w:r>
+    </w:p>
+    <w:p>
+      <w:pPr>
+        <w:rPr>
+          <w:lang w:val="en-US"/>
+        </w:rPr>
+      </w:pPr>
+      <w:r>
+        <w:rPr>
+          <w:lang w:val="en-US"/>
+        </w:rPr>
+        <w:t>------------------------------------------------------------------------------------------------</w:t>
+      </w:r>
+    </w:p>
+    <w:p>
+      <w:pPr>
+        <w:rPr>
+          <w:lang w:val="en-US"/>
+        </w:rPr>
+      </w:pPr>
+    </w:p>
+    <w:p>
+      <w:pPr>
+        <w:rPr>
+          <w:lang w:val="en-US"/>
+        </w:rPr>
+      </w:pPr>
+      <w:r>
+        <w:rPr>
+          <w:lang w:val="en-US"/>
+        </w:rPr>
+        <w:t>13] A company performs monthly maintenance on its AWS infrastructure. During these maintenance activities, the company needs to rotate the credentials for its Amazon RDS for MySQL databases across multiple AWS Regions.</w:t>
+      </w:r>
+    </w:p>
+    <w:p>
+      <w:pPr>
+        <w:rPr>
+          <w:lang w:val="en-US"/>
+        </w:rPr>
+      </w:pPr>
+      <w:r>
+        <w:rPr>
+          <w:lang w:val="en-US"/>
+        </w:rPr>
+        <w:t>Which solution will meet these requirements with the LEAST operational overhead?</w:t>
+      </w:r>
+    </w:p>
+    <w:p>
+      <w:pPr>
+        <w:rPr>
+          <w:lang w:val="en-US"/>
+        </w:rPr>
+      </w:pPr>
+    </w:p>
+    <w:p>
+      <w:pPr>
+        <w:rPr>
+          <w:lang w:val="en-US"/>
+        </w:rPr>
+      </w:pPr>
+      <w:r>
+        <w:rPr>
+          <w:lang w:val="en-US"/>
+        </w:rPr>
+        <w:t>A. Store the credentials as secrets in AWS Secrets Manager. Use multi-Region secret replication for the required Regions. Configure Secrets Manager to rotate the secrets on a schedule.</w:t>
+      </w:r>
+    </w:p>
+    <w:p>
+      <w:pPr>
+        <w:rPr>
+          <w:lang w:val="en-US"/>
+        </w:rPr>
+      </w:pPr>
+    </w:p>
+    <w:p>
+      <w:pPr>
+        <w:rPr>
+          <w:lang w:val="en-US"/>
+        </w:rPr>
+      </w:pPr>
+      <w:r>
+        <w:rPr>
+          <w:lang w:val="en-US"/>
+        </w:rPr>
+        <w:t xml:space="preserve">AWS Secrets Manager allows you to store, manage, and rotate secrets, such as database credentials, across multiple AWS Regions. By enabling multi-Region secret replication, you can replicate the secrets across the required Regions to allow for seamless rotation of the credentials during maintenance activities. Additionally, Secrets Manager provides automatic rotation of secrets on a schedule, which would minimize the operational overhead of rotating the credentials </w:t>
       </w:r>
       <w:proofErr w:type="gramStart"/>
       <w:r>
         <w:rPr>
           <w:lang w:val="en-US"/>
         </w:rPr>
-        <w:t>should a solutions</w:t>
+        <w:t>on a monthly basis</w:t>
       </w:r>
       <w:proofErr w:type="gramEnd"/>
       <w:r>
         <w:rPr>
           <w:lang w:val="en-US"/>
         </w:rPr>
-        <w:t xml:space="preserve"> architect propose to ensure users see </w:t>
+        <w:t>.</w:t>
+      </w:r>
+    </w:p>
+    <w:p>
+      <w:pPr>
+        <w:rPr>
+          <w:lang w:val="en-US"/>
+        </w:rPr>
+      </w:pPr>
+      <w:r>
+        <w:rPr>
+          <w:lang w:val="en-US"/>
+        </w:rPr>
+        <w:t>-----------------------------------------------------------------------------------</w:t>
+      </w:r>
+    </w:p>
+    <w:p>
+      <w:pPr>
+        <w:rPr>
+          <w:lang w:val="en-US"/>
+        </w:rPr>
+      </w:pPr>
+    </w:p>
+    <w:p>
+      <w:pPr>
+        <w:rPr>
+          <w:lang w:val="en-US"/>
+        </w:rPr>
+      </w:pPr>
+      <w:r>
+        <w:rPr>
+          <w:lang w:val="en-US"/>
+        </w:rPr>
+        <w:t>14] A company runs an ecommerce application on Amazon EC2 instances behind an Application Load Balancer. The instances run in an Amazon EC2 Auto Scaling group across multiple Availability Zones. The Auto Scaling group scales based on CPU utilization metrics. The ecommerce application stores the transaction data in a MySQL 8.0 database that is hosted on a large EC2 instance.</w:t>
+      </w:r>
+    </w:p>
+    <w:p>
+      <w:pPr>
+        <w:rPr>
+          <w:lang w:val="en-US"/>
+        </w:rPr>
+      </w:pPr>
+      <w:r>
+        <w:rPr>
+          <w:lang w:val="en-US"/>
+        </w:rPr>
+        <w:t xml:space="preserve">The database's performance degrades quickly as application load increases. The application handles more read requests than </w:t>
       </w:r>
       <w:proofErr w:type="gramStart"/>
       <w:r>
         <w:rPr>
           <w:lang w:val="en-US"/>
         </w:rPr>
-        <w:t>all of</w:t>
+        <w:t>write</w:t>
       </w:r>
       <w:proofErr w:type="gramEnd"/>
       <w:r>
         <w:rPr>
           <w:lang w:val="en-US"/>
         </w:rPr>
-        <w:t xml:space="preserve"> their documents at once?</w:t>
-      </w:r>
-    </w:p>
-    <w:p>
-      <w:pPr>
-        <w:rPr>
-          <w:lang w:val="en-US"/>
-        </w:rPr>
-      </w:pPr>
-    </w:p>
-    <w:p>
-      <w:pPr>
-        <w:rPr>
-          <w:lang w:val="en-US"/>
-        </w:rPr>
-      </w:pPr>
-      <w:r>
-        <w:rPr>
-          <w:lang w:val="en-US"/>
-        </w:rPr>
-        <w:t>C. Copy the data from both EBS volumes to Amazon EFS. Modify the application to save new documents to Amazon EFS</w:t>
-      </w:r>
-    </w:p>
-    <w:p>
-      <w:pPr>
-        <w:rPr>
-          <w:lang w:val="en-US"/>
-        </w:rPr>
-      </w:pPr>
-    </w:p>
-    <w:p>
-      <w:pPr>
-        <w:rPr>
-          <w:lang w:val="en-US"/>
-        </w:rPr>
-      </w:pPr>
-      <w:r>
-        <w:rPr>
-          <w:lang w:val="en-US"/>
-        </w:rPr>
-        <w:t>Option C, which involves copying the data to Amazon EFS and modifying the application to use Amazon EFS for document storage, is the most appropriate solution to ensure users can see all their documents at once in the duplicated architecture. Amazon EFS provides scalability, availability, and shared access, allowing both EC2 instances to access and synchronize the documents seamlessly. Unlike EBS volumes or snapshots, which cannot be shared in real time across multiple instances and Availability Zones, Amazon EFS allows both EC2 instances to access the same file system simultaneously, ensuring all users see the same set of documents regardless of which instance serves their request.</w:t>
-      </w:r>
-    </w:p>
-    <w:p>
-      <w:pPr>
-        <w:rPr>
-          <w:lang w:val="en-US"/>
-        </w:rPr>
-      </w:pPr>
-      <w:r>
-        <w:rPr>
-          <w:lang w:val="en-US"/>
-        </w:rPr>
-        <w:t>-------------------------------------------------------------------------------------</w:t>
-      </w:r>
-    </w:p>
-    <w:p>
-      <w:pPr>
-        <w:rPr>
-          <w:lang w:val="en-US"/>
-        </w:rPr>
-      </w:pPr>
-    </w:p>
-    <w:p>
-      <w:pPr>
-        <w:rPr>
-          <w:lang w:val="en-US"/>
-        </w:rPr>
-      </w:pPr>
-      <w:r>
-        <w:rPr>
-          <w:lang w:val="en-US"/>
-        </w:rPr>
-        <w:t>6</w:t>
-      </w:r>
-      <w:r>
-        <w:rPr>
-          <w:lang w:val="en-US"/>
-        </w:rPr>
-        <w:t xml:space="preserve">] </w:t>
-      </w:r>
-      <w:r>
-        <w:rPr>
-          <w:lang w:val="en-US"/>
-        </w:rPr>
-        <w:t xml:space="preserve">A company uses NFS to store large video files in on-premises network attached storage. Each video file ranges in size from 1 MB to 500 GB. The total storage is 70 TB and is no longer growing. The company </w:t>
+        <w:t xml:space="preserve"> transactions. The company wants a solution that will automatically scale the database to meet the demand </w:t>
       </w:r>
       <w:proofErr w:type="gramStart"/>
       <w:r>
         <w:rPr>
           <w:lang w:val="en-US"/>
         </w:rPr>
-        <w:t>decides</w:t>
+        <w:t>of</w:t>
       </w:r>
       <w:proofErr w:type="gramEnd"/>
       <w:r>
         <w:rPr>
           <w:lang w:val="en-US"/>
         </w:rPr>
-        <w:t xml:space="preserve"> to migrate the video files to Amazon S3. The company must migrate the video files as soon as possible while using the least possible network bandwidth.</w:t>
+        <w:t xml:space="preserve"> unpredictable read workloads while maintaining high availability.</w:t>
       </w:r>
     </w:p>
     <w:p>
@@ -1205,922 +2009,40 @@
         <w:rPr>
           <w:lang w:val="en-US"/>
         </w:rPr>
-        <w:t xml:space="preserve">  B Create an AWS Snowball Edge job. Receive a Snowball Edge device on premises. Use the Snowball Edge client to transfer data to the device. Return the device so that AWS can import the data into Amazon S3</w:t>
-      </w:r>
-    </w:p>
-    <w:p>
-      <w:pPr>
-        <w:rPr>
-          <w:lang w:val="en-US"/>
-        </w:rPr>
-      </w:pPr>
-    </w:p>
-    <w:p>
-      <w:pPr>
-        <w:rPr>
-          <w:lang w:val="en-US"/>
-        </w:rPr>
-      </w:pPr>
-      <w:r>
-        <w:rPr>
-          <w:lang w:val="en-US"/>
-        </w:rPr>
-        <w:t xml:space="preserve"> On a Snowball Edge device you can copy files with a speed of up to 100Gbps. 70TB will take around 5600 seconds, so very quickly, less than 2 hours. The downside is that it'll take between 4-6 working days to receive the device and then another 2-3 working days to send it back and for AWS to move the data onto S3 once it reaches them. Total time: 6-9 working days. Bandwidth used: 0.</w:t>
-      </w:r>
-    </w:p>
-    <w:p>
-      <w:pPr>
-        <w:rPr>
-          <w:lang w:val="en-US"/>
-        </w:rPr>
-      </w:pPr>
-      <w:r>
-        <w:rPr>
-          <w:lang w:val="en-US"/>
-        </w:rPr>
-        <w:t>---------------------------------------------------------</w:t>
-      </w:r>
-    </w:p>
-    <w:p>
-      <w:pPr>
-        <w:rPr>
-          <w:lang w:val="en-US"/>
-        </w:rPr>
-      </w:pPr>
-    </w:p>
-    <w:p>
-      <w:pPr>
-        <w:rPr>
-          <w:lang w:val="en-US"/>
-        </w:rPr>
-      </w:pPr>
-      <w:r>
-        <w:rPr>
-          <w:lang w:val="en-US"/>
-        </w:rPr>
-        <w:t>7] A company has an application that ingests incoming messages. Dozens of other applications and microservices then quickly consume these messages. The number of messages varies drastically and sometimes increases suddenly to 100,000 each second. The company wants to decouple the solution and increase scalability.</w:t>
-      </w:r>
-    </w:p>
-    <w:p>
-      <w:pPr>
-        <w:rPr>
-          <w:lang w:val="en-US"/>
-        </w:rPr>
-      </w:pPr>
-      <w:r>
-        <w:rPr>
-          <w:lang w:val="en-US"/>
-        </w:rPr>
-        <w:t>Which solution meets these requirements?</w:t>
-      </w:r>
-    </w:p>
-    <w:p>
-      <w:pPr>
-        <w:rPr>
-          <w:lang w:val="en-US"/>
-        </w:rPr>
-      </w:pPr>
-    </w:p>
-    <w:p>
-      <w:pPr>
-        <w:rPr>
-          <w:lang w:val="en-US"/>
-        </w:rPr>
-      </w:pPr>
-      <w:r>
-        <w:rPr>
-          <w:lang w:val="en-US"/>
-        </w:rPr>
-        <w:t xml:space="preserve">D. Publish the messages to an Amazon Simple Notification Service (Amazon SNS) topic with multiple Amazon Simple Queue Service (Amazon SQS) subscriptions. Configure the consumer applications to process the messages from the queues. </w:t>
-      </w:r>
-    </w:p>
-    <w:p>
-      <w:pPr>
-        <w:rPr>
-          <w:lang w:val="en-US"/>
-        </w:rPr>
-      </w:pPr>
-    </w:p>
-    <w:p>
-      <w:pPr>
-        <w:rPr>
-          <w:lang w:val="en-US"/>
-        </w:rPr>
-      </w:pPr>
-      <w:r>
-        <w:rPr>
-          <w:lang w:val="en-US"/>
-        </w:rPr>
-        <w:t>A good practice is to also add message attributes when publishing to SNS. Each SQS subscription can have a filter policy that matches only the messages it cares about, so that only relevant messages are delivered to each SQS queue, and consumers only see/process what they need.</w:t>
-      </w:r>
-    </w:p>
-    <w:p>
-      <w:pPr>
-        <w:rPr>
-          <w:lang w:val="en-US"/>
-        </w:rPr>
-      </w:pPr>
-    </w:p>
-    <w:p>
-      <w:pPr>
-        <w:rPr>
-          <w:lang w:val="en-US"/>
-        </w:rPr>
-      </w:pPr>
+        <w:t>C. Use Amazon Aurora with a Multi-AZ deployment. Configure Aurora Auto Scaling with Aurora Replicas.</w:t>
+      </w:r>
+    </w:p>
+    <w:p>
+      <w:pPr>
+        <w:rPr>
+          <w:lang w:val="en-US"/>
+        </w:rPr>
+      </w:pPr>
+    </w:p>
+    <w:p>
+      <w:pPr>
+        <w:rPr>
+          <w:lang w:val="en-US"/>
+        </w:rPr>
+      </w:pPr>
+      <w:r>
+        <w:rPr>
+          <w:lang w:val="en-US"/>
+        </w:rPr>
+        <w:t xml:space="preserve">Option C: Using Amazon Aurora with a Multi-AZ deployment and configuring Aurora Auto Scaling with Aurora Replicas is the most appropriate solution. Aurora is a MySQL-compatible relational database engine that provides high performance and scalability. With </w:t>
+      </w:r>
       <w:proofErr w:type="gramStart"/>
       <w:r>
         <w:rPr>
           <w:lang w:val="en-US"/>
         </w:rPr>
-        <w:t>an</w:t>
+        <w:t>Multi-AZ</w:t>
       </w:r>
       <w:proofErr w:type="gramEnd"/>
       <w:r>
         <w:rPr>
           <w:lang w:val="en-US"/>
         </w:rPr>
-        <w:t xml:space="preserve"> SQS queue can handle a maximum of 3,000 messages per second. However, you can request higher throughput by contacting AWS Support. AWS can increase the message throughput for your queue beyond the default limits in increments of 300 messages per second, up to a maximum of 10,000 messages per second.</w:t>
-      </w:r>
-    </w:p>
-    <w:p>
-      <w:pPr>
-        <w:rPr>
-          <w:lang w:val="en-US"/>
-        </w:rPr>
-      </w:pPr>
-    </w:p>
-    <w:p>
-      <w:pPr>
-        <w:rPr>
-          <w:lang w:val="en-US"/>
-        </w:rPr>
-      </w:pPr>
-      <w:r>
-        <w:rPr>
-          <w:lang w:val="en-US"/>
-        </w:rPr>
-        <w:t>It's important to note that the maximum number of messages per second that a queue can handle is not the same as the maximum number of requests per second that the SQS API can handle. The SQS API is designed to handle a high volume of requests per second, so it can be used to send messages to your queue at a rate that exceeds the maximum message throughput of the queue.</w:t>
-      </w:r>
-    </w:p>
-    <w:p>
-      <w:pPr>
-        <w:rPr>
-          <w:lang w:val="en-US"/>
-        </w:rPr>
-      </w:pPr>
-      <w:r>
-        <w:rPr>
-          <w:lang w:val="en-US"/>
-        </w:rPr>
-        <w:t>--------------------------------------------------------------------------------------------------------------</w:t>
-      </w:r>
-    </w:p>
-    <w:p>
-      <w:pPr>
-        <w:rPr>
-          <w:lang w:val="en-US"/>
-        </w:rPr>
-      </w:pPr>
-      <w:r>
-        <w:rPr>
-          <w:lang w:val="en-US"/>
-        </w:rPr>
-        <w:t>8] A company is migrating a distributed application to AWS. The application serves variable workloads. The legacy platform consists of a primary server that coordinates jobs across multiple compute nodes. The company wants to modernize the application with a solution that maximizes resiliency and scalability.</w:t>
-      </w:r>
-    </w:p>
-    <w:p>
-      <w:pPr>
-        <w:rPr>
-          <w:lang w:val="en-US"/>
-        </w:rPr>
-      </w:pPr>
-      <w:r>
-        <w:rPr>
-          <w:lang w:val="en-US"/>
-        </w:rPr>
-        <w:t xml:space="preserve">How should a </w:t>
-      </w:r>
-      <w:proofErr w:type="gramStart"/>
-      <w:r>
-        <w:rPr>
-          <w:lang w:val="en-US"/>
-        </w:rPr>
-        <w:t>solutions architect</w:t>
-      </w:r>
-      <w:proofErr w:type="gramEnd"/>
-      <w:r>
-        <w:rPr>
-          <w:lang w:val="en-US"/>
-        </w:rPr>
-        <w:t xml:space="preserve"> design the architecture to meet these requirements?</w:t>
-      </w:r>
-    </w:p>
-    <w:p>
-      <w:pPr>
-        <w:rPr>
-          <w:lang w:val="en-US"/>
-        </w:rPr>
-      </w:pPr>
-    </w:p>
-    <w:p>
-      <w:pPr>
-        <w:rPr>
-          <w:lang w:val="en-US"/>
-        </w:rPr>
-      </w:pPr>
-      <w:r>
-        <w:rPr>
-          <w:lang w:val="en-US"/>
-        </w:rPr>
-        <w:t>B. Configure an Amazon Simple Queue Service (Amazon SQS) queue as a destination for the jobs. Implement the compute nodes with Amazon EC2 instances that are managed in an Auto Scaling group. Configure EC2 Auto Scaling based on the size of the queue.</w:t>
-      </w:r>
-    </w:p>
-    <w:p>
-      <w:pPr>
-        <w:rPr>
-          <w:lang w:val="en-US"/>
-        </w:rPr>
-      </w:pPr>
-    </w:p>
-    <w:p>
-      <w:pPr>
-        <w:rPr>
-          <w:lang w:val="en-US"/>
-        </w:rPr>
-      </w:pPr>
-      <w:r>
-        <w:rPr>
-          <w:lang w:val="en-US"/>
-        </w:rPr>
-        <w:t xml:space="preserve">Option B: This option provides a decoupled architecture where the jobs are sent to an SQS queue. The </w:t>
-      </w:r>
-      <w:proofErr w:type="gramStart"/>
-      <w:r>
-        <w:rPr>
-          <w:lang w:val="en-US"/>
-        </w:rPr>
-        <w:t>compute</w:t>
-      </w:r>
-      <w:proofErr w:type="gramEnd"/>
-      <w:r>
-        <w:rPr>
-          <w:lang w:val="en-US"/>
-        </w:rPr>
-        <w:t xml:space="preserve"> nodes (EC2 instances in an Auto Scaling group) can then process these jobs. Scaling based on the size of the SQS queue (the number of messages) allows the architecture to adapt to variable workloads, scaling out when the queue depth increases and scaling in when the depth decreases.</w:t>
-      </w:r>
-    </w:p>
-    <w:p>
-      <w:pPr>
-        <w:rPr>
-          <w:lang w:val="en-US"/>
-        </w:rPr>
-      </w:pPr>
-      <w:r>
-        <w:rPr>
-          <w:lang w:val="en-US"/>
-        </w:rPr>
-        <w:t>----------------------------------------------------------------</w:t>
-      </w:r>
-    </w:p>
-    <w:p>
-      <w:pPr>
-        <w:rPr>
-          <w:lang w:val="en-US"/>
-        </w:rPr>
-      </w:pPr>
-    </w:p>
-    <w:p>
-      <w:pPr>
-        <w:rPr>
-          <w:lang w:val="en-US"/>
-        </w:rPr>
-      </w:pPr>
-      <w:r>
-        <w:rPr>
-          <w:lang w:val="en-US"/>
-        </w:rPr>
-        <w:t>9] A company is running an SMB file server in its data center. The file server stores large files that are accessed frequently for the first few days after the files are created. After 7 days the files are rarely accessed.</w:t>
-      </w:r>
-    </w:p>
-    <w:p>
-      <w:pPr>
-        <w:rPr>
-          <w:lang w:val="en-US"/>
-        </w:rPr>
-      </w:pPr>
-      <w:r>
-        <w:rPr>
-          <w:lang w:val="en-US"/>
-        </w:rPr>
-        <w:t>The total data size is increasing and is close to the company's total storage capacity. A solutions architect must increase the company's available storage space without losing low-latency access to the most recently accessed files. The solutions architect must also provide file lifecycle management to avoid future storage issues.</w:t>
-      </w:r>
-    </w:p>
-    <w:p>
-      <w:pPr>
-        <w:rPr>
-          <w:lang w:val="en-US"/>
-        </w:rPr>
-      </w:pPr>
-      <w:r>
-        <w:rPr>
-          <w:lang w:val="en-US"/>
-        </w:rPr>
-        <w:t>Which solution will meet these requirements?</w:t>
-      </w:r>
-    </w:p>
-    <w:p>
-      <w:pPr>
-        <w:rPr>
-          <w:lang w:val="en-US"/>
-        </w:rPr>
-      </w:pPr>
-    </w:p>
-    <w:p>
-      <w:pPr>
-        <w:rPr>
-          <w:lang w:val="en-US"/>
-        </w:rPr>
-      </w:pPr>
-      <w:r>
-        <w:rPr>
-          <w:lang w:val="en-US"/>
-        </w:rPr>
-        <w:t>B. Create an Amazon S3 File Gateway to extend the company's storage space. Create an S3 Lifecycle policy to transition the data to S3 Glacier Deep Archive after 7 days.</w:t>
-      </w:r>
-    </w:p>
-    <w:p>
-      <w:pPr>
-        <w:rPr>
-          <w:lang w:val="en-US"/>
-        </w:rPr>
-      </w:pPr>
-    </w:p>
-    <w:p>
-      <w:pPr>
-        <w:rPr>
-          <w:lang w:val="en-US"/>
-        </w:rPr>
-      </w:pPr>
-      <w:r>
-        <w:rPr>
-          <w:lang w:val="en-US"/>
-        </w:rPr>
-        <w:lastRenderedPageBreak/>
-        <w:t>Option B: Amazon S3 File Gateway provides a hybrid cloud storage solution, integrating on-premises environments with cloud storage. Files written to the file share are automatically saved as S3 objects. With S3 Lifecycle policies, you can transition objects between storage classes. Transitioning to Glacier Deep Archive is suitable for rarely accessed files. This solution addresses both the storage capacity and lifecycle management requirements.</w:t>
-      </w:r>
-    </w:p>
-    <w:p>
-      <w:pPr>
-        <w:rPr>
-          <w:lang w:val="en-US"/>
-        </w:rPr>
-      </w:pPr>
-      <w:r>
-        <w:rPr>
-          <w:lang w:val="en-US"/>
-        </w:rPr>
-        <w:t>---------------------------------------------------------------------</w:t>
-      </w:r>
-    </w:p>
-    <w:p>
-      <w:pPr>
-        <w:rPr>
-          <w:lang w:val="en-US"/>
-        </w:rPr>
-      </w:pPr>
-    </w:p>
-    <w:p>
-      <w:pPr>
-        <w:rPr>
-          <w:lang w:val="en-US"/>
-        </w:rPr>
-      </w:pPr>
-      <w:r>
-        <w:rPr>
-          <w:lang w:val="en-US"/>
-        </w:rPr>
-        <w:t>10] A company is building an ecommerce web application on AWS. The application sends information about new orders to an Amazon API Gateway REST API to process. The company wants to ensure that orders are processed in the order that they are received.</w:t>
-      </w:r>
-    </w:p>
-    <w:p>
-      <w:pPr>
-        <w:rPr>
-          <w:lang w:val="en-US"/>
-        </w:rPr>
-      </w:pPr>
-      <w:r>
-        <w:rPr>
-          <w:lang w:val="en-US"/>
-        </w:rPr>
-        <w:t>Which solution will meet these requirements?</w:t>
-      </w:r>
-    </w:p>
-    <w:p>
-      <w:pPr>
-        <w:rPr>
-          <w:lang w:val="en-US"/>
-        </w:rPr>
-      </w:pPr>
-    </w:p>
-    <w:p>
-      <w:pPr>
-        <w:rPr>
-          <w:lang w:val="en-US"/>
-        </w:rPr>
-      </w:pPr>
-      <w:r>
-        <w:rPr>
-          <w:lang w:val="en-US"/>
-        </w:rPr>
-        <w:t>B. Use an API Gateway integration to send a message to an Amazon Simple Queue Service (Amazon SQS) FIFO queue when the application receives an order. Configure the SQS FIFO queue to invoke an AWS Lambda function for processing</w:t>
-      </w:r>
-    </w:p>
-    <w:p>
-      <w:pPr>
-        <w:rPr>
-          <w:lang w:val="en-US"/>
-        </w:rPr>
-      </w:pPr>
-    </w:p>
-    <w:p>
-      <w:pPr>
-        <w:rPr>
-          <w:lang w:val="en-US"/>
-        </w:rPr>
-      </w:pPr>
-      <w:r>
-        <w:rPr>
-          <w:lang w:val="en-US"/>
-        </w:rPr>
-        <w:t>Use an API Gateway integration to send a message to an Amazon Simple Queue Service (Amazon SQS) FIFO queue when the application receives an order. Configure the SQS FIFO queue to invoke an AWS Lambda function for processing.</w:t>
-      </w:r>
-    </w:p>
-    <w:p>
-      <w:pPr>
-        <w:rPr>
-          <w:lang w:val="en-US"/>
-        </w:rPr>
-      </w:pPr>
-      <w:r>
-        <w:rPr>
-          <w:lang w:val="en-US"/>
-        </w:rPr>
-        <w:t>----------------------------------------------------------------------------------------------------------------------</w:t>
-      </w:r>
-    </w:p>
-    <w:p>
-      <w:pPr>
-        <w:rPr>
-          <w:lang w:val="en-US"/>
-        </w:rPr>
-      </w:pPr>
-    </w:p>
-    <w:p>
-      <w:pPr>
-        <w:rPr>
-          <w:lang w:val="en-US"/>
-        </w:rPr>
-      </w:pPr>
-      <w:r>
-        <w:rPr>
-          <w:lang w:val="en-US"/>
-        </w:rPr>
-        <w:t xml:space="preserve">11] A company has an application that runs on Amazon EC2 instances and uses an Amazon Aurora database. The EC2 instances connect to the database by using </w:t>
-      </w:r>
-      <w:proofErr w:type="gramStart"/>
-      <w:r>
-        <w:rPr>
-          <w:lang w:val="en-US"/>
-        </w:rPr>
-        <w:t>user names</w:t>
-      </w:r>
-      <w:proofErr w:type="gramEnd"/>
-      <w:r>
-        <w:rPr>
-          <w:lang w:val="en-US"/>
-        </w:rPr>
-        <w:t xml:space="preserve"> and passwords that are stored locally in a file. The company wants to minimize the operational overhead of credential management.</w:t>
-      </w:r>
-    </w:p>
-    <w:p>
-      <w:pPr>
-        <w:rPr>
-          <w:lang w:val="en-US"/>
-        </w:rPr>
-      </w:pPr>
-      <w:r>
-        <w:rPr>
-          <w:lang w:val="en-US"/>
-        </w:rPr>
-        <w:t>What should a solutions architect do to accomplish this goal?</w:t>
-      </w:r>
-    </w:p>
-    <w:p>
-      <w:pPr>
-        <w:rPr>
-          <w:lang w:val="en-US"/>
-        </w:rPr>
-      </w:pPr>
-    </w:p>
-    <w:p>
-      <w:pPr>
-        <w:rPr>
-          <w:lang w:val="en-US"/>
-        </w:rPr>
-      </w:pPr>
-      <w:r>
-        <w:rPr>
-          <w:lang w:val="en-US"/>
-        </w:rPr>
-        <w:t xml:space="preserve">A. Use AWS Secrets Manager and attach an IAM role that grants access to that secret to the EC2 instances that need it. Turn on automatic rotation. </w:t>
-      </w:r>
-    </w:p>
-    <w:p>
-      <w:pPr>
-        <w:rPr>
-          <w:lang w:val="en-US"/>
-        </w:rPr>
-      </w:pPr>
-    </w:p>
-    <w:p>
-      <w:pPr>
-        <w:rPr>
-          <w:lang w:val="en-US"/>
-        </w:rPr>
-      </w:pPr>
-      <w:r>
-        <w:rPr>
-          <w:lang w:val="en-US"/>
-        </w:rPr>
-        <w:t xml:space="preserve"> AWS Secrets Manager is a secrets management service that helps you protect access to your applications, services, and IT resources. This service enables you to rotate, manage, and retrieve database credentials, API keys, and other secrets throughout their lifecycle.</w:t>
-      </w:r>
-    </w:p>
-    <w:p>
-      <w:pPr>
-        <w:rPr>
-          <w:lang w:val="en-US"/>
-        </w:rPr>
-      </w:pPr>
-      <w:r>
-        <w:rPr>
-          <w:lang w:val="en-US"/>
-        </w:rPr>
-        <w:t>------------------------------------------------------------------------------------</w:t>
-      </w:r>
-    </w:p>
-    <w:p>
-      <w:pPr>
-        <w:rPr>
-          <w:lang w:val="en-US"/>
-        </w:rPr>
-      </w:pPr>
-    </w:p>
-    <w:p>
-      <w:pPr>
-        <w:rPr>
-          <w:lang w:val="en-US"/>
-        </w:rPr>
-      </w:pPr>
-      <w:r>
-        <w:rPr>
-          <w:lang w:val="en-US"/>
-        </w:rPr>
-        <w:t xml:space="preserve">12] A global company hosts its web application on Amazon EC2 instances behind an Application Load Balancer (ALB). The web application has static data and dynamic data. The company stores its static data in an Amazon S3 bucket. The company wants to improve performance and reduce latency for </w:t>
-      </w:r>
-      <w:proofErr w:type="gramStart"/>
-      <w:r>
-        <w:rPr>
-          <w:lang w:val="en-US"/>
-        </w:rPr>
-        <w:t>the static</w:t>
-      </w:r>
-      <w:proofErr w:type="gramEnd"/>
-      <w:r>
-        <w:rPr>
-          <w:lang w:val="en-US"/>
-        </w:rPr>
-        <w:t xml:space="preserve"> data and dynamic data. The company is using its own domain name registered with Amazon Route 53.</w:t>
-      </w:r>
-    </w:p>
-    <w:p>
-      <w:pPr>
-        <w:rPr>
-          <w:lang w:val="en-US"/>
-        </w:rPr>
-      </w:pPr>
-      <w:r>
-        <w:rPr>
-          <w:lang w:val="en-US"/>
-        </w:rPr>
-        <w:t>What should a solutions architect do to meet these requirements?</w:t>
-      </w:r>
-    </w:p>
-    <w:p>
-      <w:pPr>
-        <w:rPr>
-          <w:lang w:val="en-US"/>
-        </w:rPr>
-      </w:pPr>
-    </w:p>
-    <w:p>
-      <w:pPr>
-        <w:rPr>
-          <w:lang w:val="en-US"/>
-        </w:rPr>
-      </w:pPr>
-      <w:r>
-        <w:rPr>
-          <w:lang w:val="en-US"/>
-        </w:rPr>
-        <w:lastRenderedPageBreak/>
-        <w:t>A. Create an Amazon CloudFront distribution that has the S3 bucket and the ALB as origins. Configure Route 53 to route traffic to the CloudFront distribution.</w:t>
-      </w:r>
-    </w:p>
-    <w:p>
-      <w:pPr>
-        <w:rPr>
-          <w:lang w:val="en-US"/>
-        </w:rPr>
-      </w:pPr>
-    </w:p>
-    <w:p>
-      <w:pPr>
-        <w:rPr>
-          <w:lang w:val="en-US"/>
-        </w:rPr>
-      </w:pPr>
-      <w:r>
-        <w:rPr>
-          <w:lang w:val="en-US"/>
-        </w:rPr>
-        <w:t xml:space="preserve">CloudFront with Multiple Origins: CloudFront allows you to set up multiple origins for your distribution, so you can use both the ALB (for dynamic content) and the S3 bucket (for static content) as origins. This means that both your dynamic and static content can be served through CloudFront, which will </w:t>
-      </w:r>
-      <w:proofErr w:type="gramStart"/>
-      <w:r>
-        <w:rPr>
-          <w:lang w:val="en-US"/>
-        </w:rPr>
-        <w:t>cache</w:t>
-      </w:r>
-      <w:proofErr w:type="gramEnd"/>
-      <w:r>
-        <w:rPr>
-          <w:lang w:val="en-US"/>
-        </w:rPr>
-        <w:t xml:space="preserve"> content at edge locations to reduce latency.</w:t>
-      </w:r>
-    </w:p>
-    <w:p>
-      <w:pPr>
-        <w:rPr>
-          <w:lang w:val="en-US"/>
-        </w:rPr>
-      </w:pPr>
-      <w:r>
-        <w:rPr>
-          <w:lang w:val="en-US"/>
-        </w:rPr>
-        <w:t>Route 53 Integration with CloudFront: Amazon Route 53 can be easily configured to route traffic for your domain to a CloudFront distribution. Users will access your domain, and Route 53 will direct them to the nearest CloudFront edge location.</w:t>
-      </w:r>
-    </w:p>
-    <w:p>
-      <w:pPr>
-        <w:rPr>
-          <w:lang w:val="en-US"/>
-        </w:rPr>
-      </w:pPr>
-      <w:r>
-        <w:rPr>
-          <w:lang w:val="en-US"/>
-        </w:rPr>
-        <w:t>------------------------------------------------------------------------------------------------</w:t>
-      </w:r>
-    </w:p>
-    <w:p>
-      <w:pPr>
-        <w:rPr>
-          <w:lang w:val="en-US"/>
-        </w:rPr>
-      </w:pPr>
-    </w:p>
-    <w:p>
-      <w:pPr>
-        <w:rPr>
-          <w:lang w:val="en-US"/>
-        </w:rPr>
-      </w:pPr>
-      <w:r>
-        <w:rPr>
-          <w:lang w:val="en-US"/>
-        </w:rPr>
-        <w:t>13] A company performs monthly maintenance on its AWS infrastructure. During these maintenance activities, the company needs to rotate the credentials for its Amazon RDS for MySQL databases across multiple AWS Regions.</w:t>
-      </w:r>
-    </w:p>
-    <w:p>
-      <w:pPr>
-        <w:rPr>
-          <w:lang w:val="en-US"/>
-        </w:rPr>
-      </w:pPr>
-      <w:r>
-        <w:rPr>
-          <w:lang w:val="en-US"/>
-        </w:rPr>
-        <w:t>Which solution will meet these requirements with the LEAST operational overhead?</w:t>
-      </w:r>
-    </w:p>
-    <w:p>
-      <w:pPr>
-        <w:rPr>
-          <w:lang w:val="en-US"/>
-        </w:rPr>
-      </w:pPr>
-    </w:p>
-    <w:p>
-      <w:pPr>
-        <w:rPr>
-          <w:lang w:val="en-US"/>
-        </w:rPr>
-      </w:pPr>
-      <w:r>
-        <w:rPr>
-          <w:lang w:val="en-US"/>
-        </w:rPr>
-        <w:t>A. Store the credentials as secrets in AWS Secrets Manager. Use multi-Region secret replication for the required Regions. Configure Secrets Manager to rotate the secrets on a schedule.</w:t>
-      </w:r>
-    </w:p>
-    <w:p>
-      <w:pPr>
-        <w:rPr>
-          <w:lang w:val="en-US"/>
-        </w:rPr>
-      </w:pPr>
-    </w:p>
-    <w:p>
-      <w:pPr>
-        <w:rPr>
-          <w:lang w:val="en-US"/>
-        </w:rPr>
-      </w:pPr>
-      <w:r>
-        <w:rPr>
-          <w:lang w:val="en-US"/>
-        </w:rPr>
-        <w:t xml:space="preserve">AWS Secrets Manager allows you to store, manage, and rotate secrets, such as database credentials, across multiple AWS Regions. By enabling multi-Region secret replication, you can replicate the secrets across the required Regions to allow for seamless rotation of the credentials during maintenance activities. Additionally, Secrets Manager provides automatic rotation of secrets on a schedule, which would minimize the operational overhead of rotating the credentials </w:t>
-      </w:r>
-      <w:proofErr w:type="gramStart"/>
-      <w:r>
-        <w:rPr>
-          <w:lang w:val="en-US"/>
-        </w:rPr>
-        <w:t>on a monthly basis</w:t>
-      </w:r>
-      <w:proofErr w:type="gramEnd"/>
-      <w:r>
-        <w:rPr>
-          <w:lang w:val="en-US"/>
-        </w:rPr>
-        <w:t>.</w:t>
-      </w:r>
-    </w:p>
-    <w:p>
-      <w:pPr>
-        <w:rPr>
-          <w:lang w:val="en-US"/>
-        </w:rPr>
-      </w:pPr>
-      <w:r>
-        <w:rPr>
-          <w:lang w:val="en-US"/>
-        </w:rPr>
-        <w:t>-----------------------------------------------------------------------------------</w:t>
-      </w:r>
-    </w:p>
-    <w:p>
-      <w:pPr>
-        <w:rPr>
-          <w:lang w:val="en-US"/>
-        </w:rPr>
-      </w:pPr>
-    </w:p>
-    <w:p>
-      <w:pPr>
-        <w:rPr>
-          <w:lang w:val="en-US"/>
-        </w:rPr>
-      </w:pPr>
-      <w:r>
-        <w:rPr>
-          <w:lang w:val="en-US"/>
-        </w:rPr>
-        <w:t>14] A company runs an ecommerce application on Amazon EC2 instances behind an Application Load Balancer. The instances run in an Amazon EC2 Auto Scaling group across multiple Availability Zones. The Auto Scaling group scales based on CPU utilization metrics. The ecommerce application stores the transaction data in a MySQL 8.0 database that is hosted on a large EC2 instance.</w:t>
-      </w:r>
-    </w:p>
-    <w:p>
-      <w:pPr>
-        <w:rPr>
-          <w:lang w:val="en-US"/>
-        </w:rPr>
-      </w:pPr>
-      <w:r>
-        <w:rPr>
-          <w:lang w:val="en-US"/>
-        </w:rPr>
-        <w:t xml:space="preserve">The database's performance degrades quickly as application load increases. The application handles more read requests than </w:t>
-      </w:r>
-      <w:proofErr w:type="gramStart"/>
-      <w:r>
-        <w:rPr>
-          <w:lang w:val="en-US"/>
-        </w:rPr>
-        <w:t>write</w:t>
-      </w:r>
-      <w:proofErr w:type="gramEnd"/>
-      <w:r>
-        <w:rPr>
-          <w:lang w:val="en-US"/>
-        </w:rPr>
-        <w:t xml:space="preserve"> transactions. The company wants a solution that will automatically scale the database to meet the demand </w:t>
-      </w:r>
-      <w:proofErr w:type="gramStart"/>
-      <w:r>
-        <w:rPr>
-          <w:lang w:val="en-US"/>
-        </w:rPr>
-        <w:t>of</w:t>
-      </w:r>
-      <w:proofErr w:type="gramEnd"/>
-      <w:r>
-        <w:rPr>
-          <w:lang w:val="en-US"/>
-        </w:rPr>
-        <w:t xml:space="preserve"> unpredictable read workloads while maintaining high availability.</w:t>
-      </w:r>
-    </w:p>
-    <w:p>
-      <w:pPr>
-        <w:rPr>
-          <w:lang w:val="en-US"/>
-        </w:rPr>
-      </w:pPr>
-      <w:r>
-        <w:rPr>
-          <w:lang w:val="en-US"/>
-        </w:rPr>
-        <w:t>Which solution will meet these requirements?</w:t>
-      </w:r>
-    </w:p>
-    <w:p>
-      <w:pPr>
-        <w:rPr>
-          <w:lang w:val="en-US"/>
-        </w:rPr>
-      </w:pPr>
-    </w:p>
-    <w:p>
-      <w:pPr>
-        <w:rPr>
-          <w:lang w:val="en-US"/>
-        </w:rPr>
-      </w:pPr>
-      <w:r>
-        <w:rPr>
-          <w:lang w:val="en-US"/>
-        </w:rPr>
-        <w:t>C. Use Amazon Aurora with a Multi-AZ deployment. Configure Aurora Auto Scaling with Aurora Replicas.</w:t>
-      </w:r>
-    </w:p>
-    <w:p>
-      <w:pPr>
-        <w:rPr>
-          <w:lang w:val="en-US"/>
-        </w:rPr>
-      </w:pPr>
-    </w:p>
-    <w:p>
-      <w:pPr>
-        <w:rPr>
-          <w:lang w:val="en-US"/>
-        </w:rPr>
-      </w:pPr>
-      <w:r>
-        <w:rPr>
-          <w:lang w:val="en-US"/>
-        </w:rPr>
-        <w:t xml:space="preserve">Option C: Using Amazon Aurora with a Multi-AZ deployment and configuring Aurora Auto Scaling with Aurora Replicas is the most appropriate solution. Aurora is a MySQL-compatible relational database engine that provides high performance and scalability. With </w:t>
-      </w:r>
-      <w:proofErr w:type="gramStart"/>
-      <w:r>
-        <w:rPr>
-          <w:lang w:val="en-US"/>
-        </w:rPr>
-        <w:t>Multi-AZ</w:t>
-      </w:r>
-      <w:proofErr w:type="gramEnd"/>
-      <w:r>
-        <w:rPr>
-          <w:lang w:val="en-US"/>
-        </w:rPr>
         <w:t xml:space="preserve"> deployment, the database is automatically replicated across multiple Availability Zones for high availability.</w:t>
       </w:r>
     </w:p>
@@ -2134,7 +2056,6 @@
         <w:rPr>
           <w:lang w:val="en-US"/>
         </w:rPr>
-        <w:lastRenderedPageBreak/>
         <w:t>Aurora Auto Scaling allows the database to automatically add or remove Aurora Replicas based on the workload, ensuring that read requests can be distributed effectively and the database can scale to meet demand. This provides both high availability and automatic scaling to handle unpredictable read workloads.</w:t>
       </w:r>
     </w:p>
@@ -2717,7 +2638,6 @@
         <w:rPr>
           <w:lang w:val="en-US"/>
         </w:rPr>
-        <w:lastRenderedPageBreak/>
         <w:t xml:space="preserve">An </w:t>
       </w:r>
       <w:r>
@@ -3063,11 +2983,7 @@
         <w:t>deletes the message from the queue</w:t>
       </w:r>
       <w:r>
-        <w:t xml:space="preserve">. If the Lambda function fails, the message becomes visible again after a configurable timeout, allowing for retries and ensuring </w:t>
-      </w:r>
-      <w:r>
-        <w:lastRenderedPageBreak/>
-        <w:t xml:space="preserve">the image is eventually processed. This pattern guarantees </w:t>
+        <w:t xml:space="preserve">. If the Lambda function fails, the message becomes visible again after a configurable timeout, allowing for retries and ensuring the image is eventually processed. This pattern guarantees </w:t>
       </w:r>
       <w:r>
         <w:rPr>
@@ -3423,7 +3339,6 @@
     </w:p>
     <w:p>
       <w:r>
-        <w:lastRenderedPageBreak/>
         <w:t xml:space="preserve">The solution that will meet these requirements with the least operational overhead is </w:t>
       </w:r>
       <w:r>
@@ -3972,7 +3887,6 @@
           <w:bCs/>
           <w:highlight w:val="yellow"/>
         </w:rPr>
-        <w:lastRenderedPageBreak/>
         <w:t>firewall</w:t>
       </w:r>
       <w:r>
@@ -4539,7 +4453,6 @@
     </w:p>
     <w:p>
       <w:r>
-        <w:lastRenderedPageBreak/>
         <w:t xml:space="preserve">The solution that will meet these requirements with the </w:t>
       </w:r>
       <w:r>
@@ -4891,15 +4804,7 @@
         <w:t>Amazon DynamoDB</w:t>
       </w:r>
       <w:r>
-        <w:t xml:space="preserve"> is a fully managed, serverless NoSQL database service that delivers single-digit millisecond performance at any scale. It's designed for high-performance, high-traffic applications that require low-latency access to data. This is crucial for a "one-deal-a-day" site where product and order data </w:t>
-      </w:r>
-      <w:proofErr w:type="gramStart"/>
-      <w:r>
-        <w:t>needs</w:t>
-      </w:r>
-      <w:proofErr w:type="gramEnd"/>
-      <w:r>
-        <w:t xml:space="preserve"> to be accessed extremely quickly by millions of users.</w:t>
+        <w:t xml:space="preserve"> is a fully managed, serverless NoSQL database service that delivers single-digit millisecond performance at any scale. It's designed for high-performance, high-traffic applications that require low-latency access to data. This is crucial for a "one-deal-a-day" site where product and order data needs to be accessed extremely quickly by millions of users.</w:t>
       </w:r>
     </w:p>
     <w:p>
@@ -4965,7 +4870,6 @@
         </w:numPr>
       </w:pPr>
       <w:r>
-        <w:lastRenderedPageBreak/>
         <w:t xml:space="preserve">While S3 and CloudFront are excellent for static content, </w:t>
       </w:r>
       <w:r>
@@ -5426,7 +5330,6 @@
         <w:rPr>
           <w:lang w:val="en-US"/>
         </w:rPr>
-        <w:lastRenderedPageBreak/>
         <w:t xml:space="preserve">Which storage solution will meet these requirements MOST cost-effectively? </w:t>
       </w:r>
     </w:p>
@@ -5837,7 +5740,6 @@
         </w:numPr>
       </w:pPr>
       <w:r>
-        <w:lastRenderedPageBreak/>
         <w:t xml:space="preserve">Instead of directly writing to the database, it immediately places this information as a message into an </w:t>
       </w:r>
       <w:r>
@@ -6384,7 +6286,6 @@
     </w:p>
     <w:p>
       <w:r>
-        <w:lastRenderedPageBreak/>
         <w:t>Here's why it's the best choice for this goal:</w:t>
       </w:r>
     </w:p>
@@ -6730,7 +6631,6 @@
         <w:rPr>
           <w:lang w:val="en-US"/>
         </w:rPr>
-        <w:lastRenderedPageBreak/>
         <w:t>Share a single dashboard and designate specific email addresses of the people who can view the dashboard. Each of these users creates their own password that they must enter to view the dashboard.</w:t>
       </w:r>
     </w:p>
@@ -7146,11 +7046,7 @@
         <w:t>security risks</w:t>
       </w:r>
       <w:r>
-        <w:t xml:space="preserve">. Managing a bastion server, RDP access, and cached AWS credentials on a shared machine is </w:t>
-      </w:r>
-      <w:r>
-        <w:lastRenderedPageBreak/>
-        <w:t>complex, expensive, and goes against security best practices for simple dashboard viewing. It's a vastly over-engineered solution for the problem.</w:t>
+        <w:t>. Managing a bastion server, RDP access, and cached AWS credentials on a shared machine is complex, expensive, and goes against security best practices for simple dashboard viewing. It's a vastly over-engineered solution for the problem.</w:t>
       </w:r>
     </w:p>
     <w:p>
@@ -7564,7 +7460,6 @@
         </w:numPr>
       </w:pPr>
       <w:r>
-        <w:lastRenderedPageBreak/>
         <w:t xml:space="preserve">A </w:t>
       </w:r>
       <w:r>
@@ -8005,7 +7900,6 @@
         <w:rPr>
           <w:lang w:val="en-US"/>
         </w:rPr>
-        <w:lastRenderedPageBreak/>
         <w:t xml:space="preserve">30] A development team runs monthly resource-intensive tests on its </w:t>
       </w:r>
       <w:proofErr w:type="gramStart"/>
@@ -8325,14 +8219,7 @@
         <w:rPr>
           <w:lang w:val="en-US"/>
         </w:rPr>
-        <w:t xml:space="preserve">33] A company runs an online marketplace web application on AWS. The application serves hundreds of thousands of users during peak hours. The company needs a scalable, near-real-time solution to share the </w:t>
-      </w:r>
-      <w:r>
-        <w:rPr>
-          <w:lang w:val="en-US"/>
-        </w:rPr>
-        <w:lastRenderedPageBreak/>
-        <w:t>details of millions of financial transactions with several other internal applications. Transactions also need to be processed to remove sensitive data before being stored in a document database for low-latency retrieval.</w:t>
+        <w:t>33] A company runs an online marketplace web application on AWS. The application serves hundreds of thousands of users during peak hours. The company needs a scalable, near-real-time solution to share the details of millions of financial transactions with several other internal applications. Transactions also need to be processed to remove sensitive data before being stored in a document database for low-latency retrieval.</w:t>
       </w:r>
     </w:p>
     <w:p>
@@ -8611,7 +8498,6 @@
         <w:rPr>
           <w:lang w:val="en-US"/>
         </w:rPr>
-        <w:lastRenderedPageBreak/>
         <w:t>Which solution meets these requirements?</w:t>
       </w:r>
     </w:p>
@@ -9045,7 +8931,6 @@
           <w:b/>
           <w:bCs/>
         </w:rPr>
-        <w:lastRenderedPageBreak/>
         <w:t>Create a customer managed KMS key and an S3 bucket in each Region:</w:t>
       </w:r>
       <w:r>
@@ -9428,7 +9313,6 @@
         <w:ind w:left="2160"/>
       </w:pPr>
       <w:r>
-        <w:lastRenderedPageBreak/>
         <w:t>Integrating encryption libraries into your application.</w:t>
       </w:r>
     </w:p>
@@ -9795,7 +9679,6 @@
     </w:p>
     <w:p>
       <w:r>
-        <w:lastRenderedPageBreak/>
         <w:pict w14:anchorId="32423C99">
           <v:rect id="_x0000_i1043" style="width:0;height:1.5pt" o:hralign="center" o:hrstd="t" o:hr="t" fillcolor="#a0a0a0" stroked="f"/>
         </w:pict>
@@ -10142,7 +10025,6 @@
         </w:numPr>
       </w:pPr>
       <w:r>
-        <w:lastRenderedPageBreak/>
         <w:t>Deploying and maintaining a bastion host (patching, security, scaling, cost).</w:t>
       </w:r>
     </w:p>
@@ -10451,7 +10333,6 @@
           <w:b/>
           <w:bCs/>
         </w:rPr>
-        <w:lastRenderedPageBreak/>
         <w:t>S3 as the Origin:</w:t>
       </w:r>
       <w:r>
@@ -10888,7 +10769,6 @@
         <w:rPr>
           <w:lang w:val="en-US"/>
         </w:rPr>
-        <w:lastRenderedPageBreak/>
         <w:t xml:space="preserve">Using Amazon Provisioned IOPS (PIOPS) SSD storage is the best way to solve the performance issue of insert operations taking 10 seconds or longer on an Amazon RDS for MySQL database table with more than 10 million rows and 2 TB of </w:t>
       </w:r>
       <w:proofErr w:type="gramStart"/>
@@ -11491,7 +11371,6 @@
         <w:rPr>
           <w:lang w:val="en-US"/>
         </w:rPr>
-        <w:lastRenderedPageBreak/>
         <w:t>40] A company has thousands of edge devices that collectively generate 1 TB of status alerts each day. Each alert is approximately 2 KB in size. A solutions architect needs to implement a solution to ingest and store the alerts for future analysis.</w:t>
       </w:r>
     </w:p>
@@ -12080,11 +11959,7 @@
         <w:t>S3 Lifecycle configuration</w:t>
       </w:r>
       <w:r>
-        <w:t xml:space="preserve"> allows you to automatically transition data to different S3 storage classes or archive it to Amazon S3 Glacier based on rules you define. Setting a rule to "transition data to Amazon S3 Glacier after 14 days" directly meets the </w:t>
-      </w:r>
-      <w:r>
-        <w:lastRenderedPageBreak/>
-        <w:t>requirement to "archive any data older than 14 days" and minimizes costs for long-term storage. S3 Glacier is significantly cheaper than S3 Standard for archival purposes</w:t>
+        <w:t xml:space="preserve"> allows you to automatically transition data to different S3 storage classes or archive it to Amazon S3 Glacier based on rules you define. Setting a rule to "transition data to Amazon S3 Glacier after 14 days" directly meets the requirement to "archive any data older than 14 days" and minimizes costs for long-term storage. S3 Glacier is significantly cheaper than S3 Standard for archival purposes</w:t>
       </w:r>
     </w:p>
     <w:p>
@@ -12722,7 +12597,6 @@
           <w:b/>
           <w:bCs/>
         </w:rPr>
-        <w:lastRenderedPageBreak/>
         <w:t>Cost:</w:t>
       </w:r>
       <w:r>
@@ -13395,7 +13269,6 @@
         <w:rPr>
           <w:lang w:val="en-US"/>
         </w:rPr>
-        <w:lastRenderedPageBreak/>
         <w:t>----------------------------------------------------------------------------------</w:t>
       </w:r>
     </w:p>
@@ -13902,7 +13775,7 @@
     <w:p>
       <w:r>
         <w:pict w14:anchorId="3784EC0E">
-          <v:rect id="_x0000_i1079" style="width:0;height:1.5pt" o:hralign="center" o:hrstd="t" o:hrnoshade="t" o:hr="t" fillcolor="#1b1c1d" stroked="f"/>
+          <v:rect id="_x0000_i1050" style="width:0;height:1.5pt" o:hralign="center" o:hrstd="t" o:hrnoshade="t" o:hr="t" fillcolor="#1b1c1d" stroked="f"/>
         </w:pict>
       </w:r>
     </w:p>
@@ -14281,7 +14154,6 @@
           <w:szCs w:val="24"/>
           <w:lang w:val="en-US"/>
         </w:rPr>
-        <w:lastRenderedPageBreak/>
         <w:t>B.</w:t>
       </w:r>
       <w:r>
@@ -14327,7 +14199,7 @@
     <w:p>
       <w:r>
         <w:pict w14:anchorId="418460AA">
-          <v:rect id="_x0000_i1050" style="width:0;height:1.5pt" o:hralign="center" o:hrstd="t" o:hr="t" fillcolor="#a0a0a0" stroked="f"/>
+          <v:rect id="_x0000_i1051" style="width:0;height:1.5pt" o:hralign="center" o:hrstd="t" o:hr="t" fillcolor="#a0a0a0" stroked="f"/>
         </w:pict>
       </w:r>
     </w:p>
@@ -14390,7 +14262,7 @@
     <w:p>
       <w:r>
         <w:pict w14:anchorId="0E7D2ECE">
-          <v:rect id="_x0000_i1051" style="width:0;height:1.5pt" o:hralign="center" o:hrstd="t" o:hr="t" fillcolor="#a0a0a0" stroked="f"/>
+          <v:rect id="_x0000_i1052" style="width:0;height:1.5pt" o:hralign="center" o:hrstd="t" o:hr="t" fillcolor="#a0a0a0" stroked="f"/>
         </w:pict>
       </w:r>
     </w:p>
@@ -15236,14 +15108,7 @@
         <w:rPr>
           <w:lang w:val="en-US"/>
         </w:rPr>
-        <w:t xml:space="preserve">Some quotas can be increased, while others cannot. To request an increase to a quota, use the Service Quotas console. To learn how to request an increase, see Requesting a quota increase in the Service Quotas User </w:t>
-      </w:r>
-      <w:r>
-        <w:rPr>
-          <w:lang w:val="en-US"/>
-        </w:rPr>
-        <w:lastRenderedPageBreak/>
-        <w:t>Guide. If a quota isn't available on the Service Quotas console, use the service limit increase form on the AWS Support Center Console to request an increase to the quota.</w:t>
+        <w:t>Some quotas can be increased, while others cannot. To request an increase to a quota, use the Service Quotas console. To learn how to request an increase, see Requesting a quota increase in the Service Quotas User Guide. If a quota isn't available on the Service Quotas console, use the service limit increase form on the AWS Support Center Console to request an increase to the quota.</w:t>
       </w:r>
     </w:p>
     <w:p>
@@ -15391,7 +15256,7 @@
     <w:p>
       <w:r>
         <w:pict w14:anchorId="73794E87">
-          <v:rect id="_x0000_i1052" style="width:0;height:1.5pt" o:hralign="center" o:hrstd="t" o:hr="t" fillcolor="#a0a0a0" stroked="f"/>
+          <v:rect id="_x0000_i1053" style="width:0;height:1.5pt" o:hralign="center" o:hrstd="t" o:hr="t" fillcolor="#a0a0a0" stroked="f"/>
         </w:pict>
       </w:r>
     </w:p>
@@ -15768,7 +15633,7 @@
     <w:p>
       <w:r>
         <w:pict w14:anchorId="0FC68C01">
-          <v:rect id="_x0000_i1053" style="width:0;height:1.5pt" o:hralign="center" o:hrstd="t" o:hr="t" fillcolor="#a0a0a0" stroked="f"/>
+          <v:rect id="_x0000_i1054" style="width:0;height:1.5pt" o:hralign="center" o:hrstd="t" o:hr="t" fillcolor="#a0a0a0" stroked="f"/>
         </w:pict>
       </w:r>
     </w:p>
@@ -15969,7 +15834,7 @@
     <w:p>
       <w:r>
         <w:pict w14:anchorId="4EF5B8B0">
-          <v:rect id="_x0000_i1054" style="width:0;height:1.5pt" o:hralign="center" o:hrstd="t" o:hr="t" fillcolor="#a0a0a0" stroked="f"/>
+          <v:rect id="_x0000_i1055" style="width:0;height:1.5pt" o:hralign="center" o:hrstd="t" o:hr="t" fillcolor="#a0a0a0" stroked="f"/>
         </w:pict>
       </w:r>
     </w:p>
@@ -16513,7 +16378,7 @@
     <w:p>
       <w:r>
         <w:pict w14:anchorId="43BB05DD">
-          <v:rect id="_x0000_i1055" style="width:0;height:1.5pt" o:hralign="center" o:hrstd="t" o:hr="t" fillcolor="#a0a0a0" stroked="f"/>
+          <v:rect id="_x0000_i1056" style="width:0;height:1.5pt" o:hralign="center" o:hrstd="t" o:hr="t" fillcolor="#a0a0a0" stroked="f"/>
         </w:pict>
       </w:r>
     </w:p>
@@ -16619,11 +16484,7 @@
         <w:t>S3 Glacier Deep Archive</w:t>
       </w:r>
       <w:r>
-        <w:t xml:space="preserve"> is designed for data that is accessed once or </w:t>
-      </w:r>
-      <w:r>
-        <w:lastRenderedPageBreak/>
-        <w:t xml:space="preserve">twice a year and can take up to 12 hours for retrieval, which may be a longer delay than the company is willing to accept. Using a separate </w:t>
+        <w:t xml:space="preserve"> is designed for data that is accessed once or twice a year and can take up to 12 hours for retrieval, which may be a longer delay than the company is willing to accept. Using a separate </w:t>
       </w:r>
       <w:r>
         <w:rPr>
@@ -16729,7 +16590,7 @@
     <w:p>
       <w:r>
         <w:pict w14:anchorId="78DCC586">
-          <v:rect id="_x0000_i1056" style="width:0;height:1.5pt" o:hralign="center" o:hrstd="t" o:hrnoshade="t" o:hr="t" fillcolor="#1b1c1d" stroked="f"/>
+          <v:rect id="_x0000_i1057" style="width:0;height:1.5pt" o:hralign="center" o:hrstd="t" o:hrnoshade="t" o:hr="t" fillcolor="#1b1c1d" stroked="f"/>
         </w:pict>
       </w:r>
     </w:p>
@@ -16800,7 +16661,7 @@
     <w:p>
       <w:r>
         <w:pict w14:anchorId="4892A881">
-          <v:rect id="_x0000_i1057" style="width:0;height:1.5pt" o:hralign="center" o:hrstd="t" o:hrnoshade="t" o:hr="t" fillcolor="#1b1c1d" stroked="f"/>
+          <v:rect id="_x0000_i1058" style="width:0;height:1.5pt" o:hralign="center" o:hrstd="t" o:hrnoshade="t" o:hr="t" fillcolor="#1b1c1d" stroked="f"/>
         </w:pict>
       </w:r>
     </w:p>
@@ -17188,47 +17049,6 @@
     <w:p>
       <w:r>
         <w:pict w14:anchorId="3D573C66">
-          <v:rect id="_x0000_i1058" style="width:0;height:1.5pt" o:hralign="center" o:hrstd="t" o:hrnoshade="t" o:hr="t" fillcolor="#1b1c1d" stroked="f"/>
-        </w:pict>
-      </w:r>
-    </w:p>
-    <w:p>
-      <w:pPr>
-        <w:ind w:left="720"/>
-        <w:rPr>
-          <w:b/>
-          <w:bCs/>
-        </w:rPr>
-      </w:pPr>
-      <w:r>
-        <w:rPr>
-          <w:b/>
-          <w:bCs/>
-        </w:rPr>
-        <w:t>A. Configure the application to send the data to Amazon Kinesis Data Firehose.</w:t>
-      </w:r>
-    </w:p>
-    <w:p>
-      <w:pPr>
-        <w:ind w:left="720"/>
-      </w:pPr>
-      <w:r>
-        <w:t xml:space="preserve">This option is incorrect because Amazon Kinesis Data Firehose is designed for </w:t>
-      </w:r>
-      <w:r>
-        <w:rPr>
-          <w:b/>
-          <w:bCs/>
-        </w:rPr>
-        <w:t>streaming data</w:t>
-      </w:r>
-      <w:r>
-        <w:t>. The problem describes a batch process that runs on a schedule (once every morning), not a continuous stream of data. Firehose is great for collecting and loading large amounts of real-time data into a data lake or data warehouse, but it doesn't have the built-in functionality to initiate a scheduled API call, format the data into an HTML report, or send emails.</w:t>
-      </w:r>
-    </w:p>
-    <w:p>
-      <w:r>
-        <w:pict w14:anchorId="56B4DF3C">
           <v:rect id="_x0000_i1059" style="width:0;height:1.5pt" o:hralign="center" o:hrstd="t" o:hrnoshade="t" o:hr="t" fillcolor="#1b1c1d" stroked="f"/>
         </w:pict>
       </w:r>
@@ -17246,6 +17066,47 @@
           <w:b/>
           <w:bCs/>
         </w:rPr>
+        <w:t>A. Configure the application to send the data to Amazon Kinesis Data Firehose.</w:t>
+      </w:r>
+    </w:p>
+    <w:p>
+      <w:pPr>
+        <w:ind w:left="720"/>
+      </w:pPr>
+      <w:r>
+        <w:t xml:space="preserve">This option is incorrect because Amazon Kinesis Data Firehose is designed for </w:t>
+      </w:r>
+      <w:r>
+        <w:rPr>
+          <w:b/>
+          <w:bCs/>
+        </w:rPr>
+        <w:t>streaming data</w:t>
+      </w:r>
+      <w:r>
+        <w:t>. The problem describes a batch process that runs on a schedule (once every morning), not a continuous stream of data. Firehose is great for collecting and loading large amounts of real-time data into a data lake or data warehouse, but it doesn't have the built-in functionality to initiate a scheduled API call, format the data into an HTML report, or send emails.</w:t>
+      </w:r>
+    </w:p>
+    <w:p>
+      <w:r>
+        <w:pict w14:anchorId="56B4DF3C">
+          <v:rect id="_x0000_i1060" style="width:0;height:1.5pt" o:hralign="center" o:hrstd="t" o:hrnoshade="t" o:hr="t" fillcolor="#1b1c1d" stroked="f"/>
+        </w:pict>
+      </w:r>
+    </w:p>
+    <w:p>
+      <w:pPr>
+        <w:ind w:left="720"/>
+        <w:rPr>
+          <w:b/>
+          <w:bCs/>
+        </w:rPr>
+      </w:pPr>
+      <w:r>
+        <w:rPr>
+          <w:b/>
+          <w:bCs/>
+        </w:rPr>
         <w:t xml:space="preserve">C. Create an Amazon </w:t>
       </w:r>
       <w:proofErr w:type="spellStart"/>
@@ -17344,11 +17205,7 @@
         <w:t>used for</w:t>
       </w:r>
       <w:r>
-        <w:t xml:space="preserve"> large-scale, big data workloads. A Glue job would be an overly complex and expensive solution for a simple task like making </w:t>
-      </w:r>
-      <w:r>
-        <w:lastRenderedPageBreak/>
-        <w:t>an API call and creating an HTML report. An AWS Lambda function is a much more lightweight and cost-effective choice for this kind of task.</w:t>
+        <w:t xml:space="preserve"> large-scale, big data workloads. A Glue job would be an overly complex and expensive solution for a simple task like making an API call and creating an HTML report. An AWS Lambda function is a much more lightweight and cost-effective choice for this kind of task.</w:t>
       </w:r>
       <w:r>
         <w:t xml:space="preserve"> </w:t>
@@ -17357,7 +17214,7 @@
     <w:p>
       <w:r>
         <w:pict w14:anchorId="73E4D3E4">
-          <v:rect id="_x0000_i1060" style="width:0;height:1.5pt" o:hralign="center" o:hrstd="t" o:hrnoshade="t" o:hr="t" fillcolor="#1b1c1d" stroked="f"/>
+          <v:rect id="_x0000_i1061" style="width:0;height:1.5pt" o:hralign="center" o:hrstd="t" o:hrnoshade="t" o:hr="t" fillcolor="#1b1c1d" stroked="f"/>
         </w:pict>
       </w:r>
     </w:p>
@@ -17843,7 +17700,7 @@
     <w:p>
       <w:r>
         <w:pict w14:anchorId="2CA1BC87">
-          <v:rect id="_x0000_i1061" style="width:0;height:1.5pt" o:hralign="center" o:hrstd="t" o:hrnoshade="t" o:hr="t" fillcolor="#1b1c1d" stroked="f"/>
+          <v:rect id="_x0000_i1062" style="width:0;height:1.5pt" o:hralign="center" o:hrstd="t" o:hrnoshade="t" o:hr="t" fillcolor="#1b1c1d" stroked="f"/>
         </w:pict>
       </w:r>
     </w:p>
@@ -17904,7 +17761,6 @@
           <w:b/>
           <w:bCs/>
         </w:rPr>
-        <w:lastRenderedPageBreak/>
         <w:t>Incorrect storage type:</w:t>
       </w:r>
       <w:r>
@@ -18503,7 +18359,6 @@
           <w:b/>
           <w:bCs/>
         </w:rPr>
-        <w:lastRenderedPageBreak/>
         <w:t>High Availability and Durability:</w:t>
       </w:r>
       <w:r>
@@ -18677,7 +18532,7 @@
     <w:p>
       <w:r>
         <w:pict w14:anchorId="53CA53B2">
-          <v:rect id="_x0000_i1062" style="width:0;height:1.5pt" o:hralign="center" o:hrstd="t" o:hrnoshade="t" o:hr="t" fillcolor="#1b1c1d" stroked="f"/>
+          <v:rect id="_x0000_i1063" style="width:0;height:1.5pt" o:hralign="center" o:hrstd="t" o:hrnoshade="t" o:hr="t" fillcolor="#1b1c1d" stroked="f"/>
         </w:pict>
       </w:r>
     </w:p>
@@ -19469,7 +19324,6 @@
         <w:rPr>
           <w:lang w:val="en-US"/>
         </w:rPr>
-        <w:lastRenderedPageBreak/>
         <w:t>certificate associated with the company's domain name into AWS Certificate Manager (ACM) in the same Region. Attach the certificate to the</w:t>
       </w:r>
     </w:p>
@@ -19842,7 +19696,7 @@
     <w:p>
       <w:r>
         <w:pict w14:anchorId="13F9A68A">
-          <v:rect id="_x0000_i1063" style="width:0;height:1.5pt" o:hralign="center" o:hrstd="t" o:hrnoshade="t" o:hr="t" fillcolor="#1b1c1d" stroked="f"/>
+          <v:rect id="_x0000_i1064" style="width:0;height:1.5pt" o:hralign="center" o:hrstd="t" o:hrnoshade="t" o:hr="t" fillcolor="#1b1c1d" stroked="f"/>
         </w:pict>
       </w:r>
     </w:p>
@@ -20090,14 +19944,7 @@
         <w:rPr>
           <w:lang w:val="en-US"/>
         </w:rPr>
-        <w:t xml:space="preserve">58.A company wants to run its critical applications in containers to meet requirements for scalability and availability. The company prefers to focus on maintenance of the critical applications. The company does not </w:t>
-      </w:r>
-      <w:r>
-        <w:rPr>
-          <w:lang w:val="en-US"/>
-        </w:rPr>
-        <w:lastRenderedPageBreak/>
-        <w:t>want to be responsible for provisioning and managing the underlying infrastructure that runs the containerized workload.</w:t>
+        <w:t>58.A company wants to run its critical applications in containers to meet requirements for scalability and availability. The company prefers to focus on maintenance of the critical applications. The company does not want to be responsible for provisioning and managing the underlying infrastructure that runs the containerized workload.</w:t>
       </w:r>
     </w:p>
     <w:p>
@@ -20307,7 +20154,7 @@
     <w:p>
       <w:r>
         <w:pict w14:anchorId="6B76AB8F">
-          <v:rect id="_x0000_i1064" style="width:0;height:1.5pt" o:hralign="center" o:hrstd="t" o:hrnoshade="t" o:hr="t" fillcolor="#1b1c1d" stroked="f"/>
+          <v:rect id="_x0000_i1065" style="width:0;height:1.5pt" o:hralign="center" o:hrstd="t" o:hrnoshade="t" o:hr="t" fillcolor="#1b1c1d" stroked="f"/>
         </w:pict>
       </w:r>
     </w:p>
@@ -20621,7 +20468,7 @@
           <w:highlight w:val="yellow"/>
         </w:rPr>
         <w:pict w14:anchorId="42A08C54">
-          <v:rect id="_x0000_i1065" style="width:0;height:1.5pt" o:hralign="center" o:hrstd="t" o:hrnoshade="t" o:hr="t" fillcolor="#1b1c1d" stroked="f"/>
+          <v:rect id="_x0000_i1066" style="width:0;height:1.5pt" o:hralign="center" o:hrstd="t" o:hrnoshade="t" o:hr="t" fillcolor="#1b1c1d" stroked="f"/>
         </w:pict>
       </w:r>
     </w:p>
@@ -20708,7 +20555,6 @@
           <w:szCs w:val="20"/>
           <w:highlight w:val="yellow"/>
         </w:rPr>
-        <w:lastRenderedPageBreak/>
         <w:t>Provisioning:</w:t>
       </w:r>
       <w:r>
@@ -20890,7 +20736,7 @@
           <w:highlight w:val="yellow"/>
         </w:rPr>
         <w:pict w14:anchorId="24344444">
-          <v:rect id="_x0000_i1066" style="width:0;height:1.5pt" o:hralign="center" o:hrstd="t" o:hrnoshade="t" o:hr="t" fillcolor="#1b1c1d" stroked="f"/>
+          <v:rect id="_x0000_i1067" style="width:0;height:1.5pt" o:hralign="center" o:hrstd="t" o:hrnoshade="t" o:hr="t" fillcolor="#1b1c1d" stroked="f"/>
         </w:pict>
       </w:r>
     </w:p>
@@ -21269,7 +21115,7 @@
     <w:p>
       <w:r>
         <w:pict w14:anchorId="042B9EB4">
-          <v:rect id="_x0000_i1067" style="width:0;height:1.5pt" o:hralign="center" o:hrstd="t" o:hrnoshade="t" o:hr="t" fillcolor="#1b1c1d" stroked="f"/>
+          <v:rect id="_x0000_i1068" style="width:0;height:1.5pt" o:hralign="center" o:hrstd="t" o:hrnoshade="t" o:hr="t" fillcolor="#1b1c1d" stroked="f"/>
         </w:pict>
       </w:r>
     </w:p>
@@ -21367,7 +21213,6 @@
           <w:b/>
           <w:bCs/>
         </w:rPr>
-        <w:lastRenderedPageBreak/>
         <w:t>Amazon Redshift</w:t>
       </w:r>
       <w:r>
@@ -21382,7 +21227,7 @@
     <w:p>
       <w:r>
         <w:pict w14:anchorId="18740322">
-          <v:rect id="_x0000_i1068" style="width:0;height:1.5pt" o:hralign="center" o:hrstd="t" o:hrnoshade="t" o:hr="t" fillcolor="#1b1c1d" stroked="f"/>
+          <v:rect id="_x0000_i1069" style="width:0;height:1.5pt" o:hralign="center" o:hrstd="t" o:hrnoshade="t" o:hr="t" fillcolor="#1b1c1d" stroked="f"/>
         </w:pict>
       </w:r>
     </w:p>
@@ -21728,7 +21573,7 @@
     <w:p>
       <w:r>
         <w:pict w14:anchorId="35A8FB7B">
-          <v:rect id="_x0000_i1069" style="width:0;height:1.5pt" o:hralign="center" o:hrstd="t" o:hr="t" fillcolor="#a0a0a0" stroked="f"/>
+          <v:rect id="_x0000_i1070" style="width:0;height:1.5pt" o:hralign="center" o:hrstd="t" o:hr="t" fillcolor="#a0a0a0" stroked="f"/>
         </w:pict>
       </w:r>
     </w:p>
@@ -21749,7 +21594,6 @@
     </w:p>
     <w:p>
       <w:r>
-        <w:lastRenderedPageBreak/>
         <w:t xml:space="preserve">Option D, on the other hand, proposes a solution built with </w:t>
       </w:r>
       <w:r>
@@ -22149,7 +21993,7 @@
     <w:p>
       <w:r>
         <w:pict w14:anchorId="2EC46624">
-          <v:rect id="_x0000_i1070" style="width:0;height:1.5pt" o:hralign="center" o:hrstd="t" o:hrnoshade="t" o:hr="t" fillcolor="#1b1c1d" stroked="f"/>
+          <v:rect id="_x0000_i1071" style="width:0;height:1.5pt" o:hralign="center" o:hrstd="t" o:hrnoshade="t" o:hr="t" fillcolor="#1b1c1d" stroked="f"/>
         </w:pict>
       </w:r>
     </w:p>
@@ -22278,11 +22122,7 @@
         <w:t>introduces unnecessary</w:t>
       </w:r>
       <w:r>
-        <w:t xml:space="preserve"> complexity. The application would need logic to retrieve the file from S3, which adds latency and additional code to manage. The rotation process </w:t>
-      </w:r>
-      <w:r>
-        <w:lastRenderedPageBreak/>
-        <w:t>would also be complex, requiring the Lambda function to update both the RDS database and the S3 object. This is more of a do-it-yourself solution rather than leveraging a managed service designed for secrets management.</w:t>
+        <w:t xml:space="preserve"> complexity. The application would need logic to retrieve the file from S3, which adds latency and additional code to manage. The rotation process would also be complex, requiring the Lambda function to update both the RDS database and the S3 object. This is more of a do-it-yourself solution rather than leveraging a managed service designed for secrets management.</w:t>
       </w:r>
     </w:p>
     <w:p>
@@ -22693,7 +22533,7 @@
     <w:p>
       <w:r>
         <w:pict w14:anchorId="3F8F3F5B">
-          <v:rect id="_x0000_i1071" style="width:0;height:1.5pt" o:hralign="center" o:hrstd="t" o:hrnoshade="t" o:hr="t" fillcolor="#1b1c1d" stroked="f"/>
+          <v:rect id="_x0000_i1072" style="width:0;height:1.5pt" o:hralign="center" o:hrstd="t" o:hrnoshade="t" o:hr="t" fillcolor="#1b1c1d" stroked="f"/>
         </w:pict>
       </w:r>
     </w:p>
@@ -22978,7 +22818,6 @@
     </w:p>
     <w:p>
       <w:r>
-        <w:lastRenderedPageBreak/>
         <w:t xml:space="preserve">This is also incorrect. An </w:t>
       </w:r>
       <w:r>
@@ -24219,7 +24058,6 @@
           <w:bCs/>
           <w:highlight w:val="yellow"/>
         </w:rPr>
-        <w:lastRenderedPageBreak/>
         <w:t>dataset</w:t>
       </w:r>
       <w:r>
@@ -24466,7 +24304,7 @@
     <w:p>
       <w:r>
         <w:pict w14:anchorId="757E5C73">
-          <v:rect id="_x0000_i1072" style="width:0;height:1.5pt" o:hralign="center" o:hrstd="t" o:hrnoshade="t" o:hr="t" fillcolor="#1b1c1d" stroked="f"/>
+          <v:rect id="_x0000_i1073" style="width:0;height:1.5pt" o:hralign="center" o:hrstd="t" o:hrnoshade="t" o:hr="t" fillcolor="#1b1c1d" stroked="f"/>
         </w:pict>
       </w:r>
     </w:p>
@@ -35613,6 +35451,7 @@
   <w:style w:type="character" w:default="1" w:styleId="DefaultParagraphFont">
     <w:name w:val="Default Paragraph Font"/>
     <w:uiPriority w:val="1"/>
+    <w:semiHidden/>
     <w:unhideWhenUsed/>
   </w:style>
   <w:style w:type="table" w:default="1" w:styleId="TableNormal">

</xml_diff>